<commit_message>
docs(report): clickable links + TOC, fix instructor name, logical LTR tables
Polish pass on the final Word report so it is submission-perfect:
- Instructor name corrected to ד"ר ליהי רייכלסון.
- Cover URLs (live app + GitHub) are now real clickable hyperlinks.
- Table of contents entries are clickable internal links that jump to each
  section (bookmarks on the 10 headings + w:hyperlink anchors).
- Tables render in a logical order: English/numeric tables (silhouette by k,
  Jaccard-vs-Cosine, genre/rating by decade, cluster profiles) are now LEFT-TO-
  RIGHT so columns and values read in natural English + mathematical order
  (k ascending, spearman descending). The bidiVisual flip that reversed them is
  removed for those; the Hebrew sources table stays RTL. Latin font in numeric
  cells for clean digits.

Used the hebrew-document-generator skill's RTL/bidi guidance. Still exactly 10
pages; Hebrew RTL prose intact; no em dashes.

Co-Authored-By: Claude Opus 4.8 <noreply@anthropic.com>
</commit_message>
<xml_diff>
--- a/docs/report/CineMatch_Report.docx
+++ b/docs/report/CineMatch_Report.docx
@@ -74,7 +74,7 @@
           <w:sz w:val="26"/>
           <w:rtl/>
         </w:rPr>
-        <w:t>ד"ר ליהי רייקלסון · האקדמית תל-אביב-יפו</w:t>
+        <w:t>ד"ר ליהי רייכלסון · האקדמית תל-אביב-יפו</w:t>
       </w:r>
     </w:p>
     <w:p>
@@ -100,8 +100,18 @@
           <w:color w:val="1F3864"/>
           <w:sz w:val="22"/>
         </w:rPr>
-        <w:t>Live app:  https://cinematch-ai-v2.onrender.com/</w:t>
+        <w:t xml:space="preserve">Live app:  </w:t>
       </w:r>
+      <w:hyperlink r:id="rId9">
+        <w:r>
+          <w:rPr>
+            <w:color w:val="1F3864"/>
+            <w:u w:val="single"/>
+            <w:sz w:val="22"/>
+          </w:rPr>
+          <w:t xml:space="preserve">https://cinematch-ai-v2.onrender.com/</w:t>
+        </w:r>
+      </w:hyperlink>
     </w:p>
     <w:p>
       <w:pPr>
@@ -112,8 +122,18 @@
           <w:color w:val="1F3864"/>
           <w:sz w:val="22"/>
         </w:rPr>
-        <w:t>GitHub:  https://github.com/omerzion999/cinematch-v2</w:t>
+        <w:t xml:space="preserve">GitHub:  </w:t>
       </w:r>
+      <w:hyperlink r:id="rId10">
+        <w:r>
+          <w:rPr>
+            <w:color w:val="1F3864"/>
+            <w:u w:val="single"/>
+            <w:sz w:val="22"/>
+          </w:rPr>
+          <w:t xml:space="preserve">https://github.com/omerzion999/cinematch-v2</w:t>
+        </w:r>
+      </w:hyperlink>
     </w:p>
     <w:p>
       <w:r>
@@ -140,135 +160,153 @@
         <w:bidi/>
         <w:jc w:val="right"/>
       </w:pPr>
-      <w:r>
-        <w:rPr>
-          <w:rFonts w:ascii="David" w:hAnsi="David"/>
-          <w:b w:val="0"/>
-          <w:sz w:val="22"/>
-          <w:rtl/>
-        </w:rPr>
-        <w:t>1. רקע, הצהרת בעיה ויעדים</w:t>
-      </w:r>
+      <w:hyperlink w:anchor="sec1">
+        <w:r>
+          <w:rPr>
+            <w:color w:val="1F3864"/>
+            <w:u w:val="single"/>
+            <w:sz w:val="22"/>
+            <w:rtl/>
+          </w:rPr>
+          <w:t xml:space="preserve">1. רקע, הצהרת בעיה ויעדים</w:t>
+        </w:r>
+      </w:hyperlink>
     </w:p>
     <w:p>
       <w:pPr>
         <w:bidi/>
         <w:jc w:val="right"/>
       </w:pPr>
-      <w:r>
-        <w:rPr>
-          <w:rFonts w:ascii="David" w:hAnsi="David"/>
-          <w:b w:val="0"/>
-          <w:sz w:val="22"/>
-          <w:rtl/>
-        </w:rPr>
-        <w:t>2. חדשנות ומקוריות</w:t>
-      </w:r>
+      <w:hyperlink w:anchor="sec2">
+        <w:r>
+          <w:rPr>
+            <w:color w:val="1F3864"/>
+            <w:u w:val="single"/>
+            <w:sz w:val="22"/>
+            <w:rtl/>
+          </w:rPr>
+          <w:t xml:space="preserve">2. חדשנות ומקוריות</w:t>
+        </w:r>
+      </w:hyperlink>
     </w:p>
     <w:p>
       <w:pPr>
         <w:bidi/>
         <w:jc w:val="right"/>
       </w:pPr>
-      <w:r>
-        <w:rPr>
-          <w:rFonts w:ascii="David" w:hAnsi="David"/>
-          <w:b w:val="0"/>
-          <w:sz w:val="22"/>
-          <w:rtl/>
-        </w:rPr>
-        <w:t>3. עומק טכני AI (NLP/LLM)</w:t>
-      </w:r>
+      <w:hyperlink w:anchor="sec3">
+        <w:r>
+          <w:rPr>
+            <w:color w:val="1F3864"/>
+            <w:u w:val="single"/>
+            <w:sz w:val="22"/>
+            <w:rtl/>
+          </w:rPr>
+          <w:t xml:space="preserve">3. עומק טכני AI (NLP/LLM)</w:t>
+        </w:r>
+      </w:hyperlink>
     </w:p>
     <w:p>
       <w:pPr>
         <w:bidi/>
         <w:jc w:val="right"/>
       </w:pPr>
-      <w:r>
-        <w:rPr>
-          <w:rFonts w:ascii="David" w:hAnsi="David"/>
-          <w:b w:val="0"/>
-          <w:sz w:val="22"/>
-          <w:rtl/>
-        </w:rPr>
-        <w:t>4. הנתונים (Big Data): מקורות, איסוף, ניקוי והכנה</w:t>
-      </w:r>
+      <w:hyperlink w:anchor="sec4">
+        <w:r>
+          <w:rPr>
+            <w:color w:val="1F3864"/>
+            <w:u w:val="single"/>
+            <w:sz w:val="22"/>
+            <w:rtl/>
+          </w:rPr>
+          <w:t xml:space="preserve">4. הנתונים (Big Data): מקורות, איסוף, ניקוי והכנה</w:t>
+        </w:r>
+      </w:hyperlink>
     </w:p>
     <w:p>
       <w:pPr>
         <w:bidi/>
         <w:jc w:val="right"/>
       </w:pPr>
-      <w:r>
-        <w:rPr>
-          <w:rFonts w:ascii="David" w:hAnsi="David"/>
-          <w:b w:val="0"/>
-          <w:sz w:val="22"/>
-          <w:rtl/>
-        </w:rPr>
-        <w:t>5-6. בחירת מודל, מימוש והשוואה</w:t>
-      </w:r>
+      <w:hyperlink w:anchor="sec56">
+        <w:r>
+          <w:rPr>
+            <w:color w:val="1F3864"/>
+            <w:u w:val="single"/>
+            <w:sz w:val="22"/>
+            <w:rtl/>
+          </w:rPr>
+          <w:t xml:space="preserve">5-6. בחירת מודל, מימוש והשוואה</w:t>
+        </w:r>
+      </w:hyperlink>
     </w:p>
     <w:p>
       <w:pPr>
         <w:bidi/>
         <w:jc w:val="right"/>
       </w:pPr>
-      <w:r>
-        <w:rPr>
-          <w:rFonts w:ascii="David" w:hAnsi="David"/>
-          <w:b w:val="0"/>
-          <w:sz w:val="22"/>
-          <w:rtl/>
-        </w:rPr>
-        <w:t>7. בדיקה ואימות</w:t>
-      </w:r>
+      <w:hyperlink w:anchor="sec7">
+        <w:r>
+          <w:rPr>
+            <w:color w:val="1F3864"/>
+            <w:u w:val="single"/>
+            <w:sz w:val="22"/>
+            <w:rtl/>
+          </w:rPr>
+          <w:t xml:space="preserve">7. בדיקה ואימות</w:t>
+        </w:r>
+      </w:hyperlink>
     </w:p>
     <w:p>
       <w:pPr>
         <w:bidi/>
         <w:jc w:val="right"/>
       </w:pPr>
-      <w:r>
-        <w:rPr>
-          <w:rFonts w:ascii="David" w:hAnsi="David"/>
-          <w:b w:val="0"/>
-          <w:sz w:val="22"/>
-          <w:rtl/>
-        </w:rPr>
-        <w:t>8. שיקולים אתיים</w:t>
-      </w:r>
+      <w:hyperlink w:anchor="sec8">
+        <w:r>
+          <w:rPr>
+            <w:color w:val="1F3864"/>
+            <w:u w:val="single"/>
+            <w:sz w:val="22"/>
+            <w:rtl/>
+          </w:rPr>
+          <w:t xml:space="preserve">8. שיקולים אתיים</w:t>
+        </w:r>
+      </w:hyperlink>
     </w:p>
     <w:p>
       <w:pPr>
         <w:bidi/>
         <w:jc w:val="right"/>
       </w:pPr>
-      <w:r>
-        <w:rPr>
-          <w:rFonts w:ascii="David" w:hAnsi="David"/>
-          <w:b w:val="0"/>
-          <w:sz w:val="22"/>
-          <w:rtl/>
-        </w:rPr>
-        <w:t>9. מסקנות, יישום ומגבלות</w:t>
-      </w:r>
+      <w:hyperlink w:anchor="sec9">
+        <w:r>
+          <w:rPr>
+            <w:color w:val="1F3864"/>
+            <w:u w:val="single"/>
+            <w:sz w:val="22"/>
+            <w:rtl/>
+          </w:rPr>
+          <w:t xml:space="preserve">9. מסקנות, יישום ומגבלות</w:t>
+        </w:r>
+      </w:hyperlink>
     </w:p>
     <w:p>
       <w:pPr>
         <w:bidi/>
         <w:jc w:val="right"/>
       </w:pPr>
-      <w:r>
-        <w:rPr>
-          <w:rFonts w:ascii="David" w:hAnsi="David"/>
-          <w:b w:val="0"/>
-          <w:sz w:val="22"/>
-          <w:rtl/>
-        </w:rPr>
-        <w:t>10. הערכת השפעה</w:t>
-      </w:r>
+      <w:hyperlink w:anchor="sec10">
+        <w:r>
+          <w:rPr>
+            <w:color w:val="1F3864"/>
+            <w:u w:val="single"/>
+            <w:sz w:val="22"/>
+            <w:rtl/>
+          </w:rPr>
+          <w:t xml:space="preserve">10. הערכת השפעה</w:t>
+        </w:r>
+      </w:hyperlink>
     </w:p>
     <w:p>
       <w:r>
@@ -276,6 +314,7 @@
       </w:r>
     </w:p>
     <w:p>
+      <w:bookmarkStart w:id="1" w:name="sec1"/>
       <w:pPr>
         <w:pStyle w:val="Heading1"/>
         <w:bidi/>
@@ -289,6 +328,7 @@
         </w:rPr>
         <w:t>1. רקע, הצהרת בעיה ויעדים</w:t>
       </w:r>
+      <w:bookmarkEnd w:id="1"/>
     </w:p>
     <w:p>
       <w:pPr>
@@ -456,6 +496,7 @@
       </w:r>
     </w:p>
     <w:p>
+      <w:bookmarkStart w:id="2" w:name="sec2"/>
       <w:pPr>
         <w:pStyle w:val="Heading1"/>
         <w:bidi/>
@@ -469,6 +510,7 @@
         </w:rPr>
         <w:t>2. חדשנות ומקוריות</w:t>
       </w:r>
+      <w:bookmarkEnd w:id="2"/>
     </w:p>
     <w:p>
       <w:pPr>
@@ -546,6 +588,7 @@
       </w:r>
     </w:p>
     <w:p>
+      <w:bookmarkStart w:id="3" w:name="sec3"/>
       <w:pPr>
         <w:pStyle w:val="Heading1"/>
         <w:bidi/>
@@ -559,6 +602,7 @@
         </w:rPr>
         <w:t>3. עומק טכני AI (NLP/LLM)</w:t>
       </w:r>
+      <w:bookmarkEnd w:id="3"/>
     </w:p>
     <w:p>
       <w:pPr>
@@ -666,6 +710,7 @@
       </w:r>
     </w:p>
     <w:p>
+      <w:bookmarkStart w:id="4" w:name="sec4"/>
       <w:pPr>
         <w:pStyle w:val="Heading1"/>
         <w:bidi/>
@@ -679,6 +724,7 @@
         </w:rPr>
         <w:t>4. הנתונים (Big Data): מקורות, איסוף, ניקוי והכנה</w:t>
       </w:r>
+      <w:bookmarkEnd w:id="4"/>
     </w:p>
     <w:p>
       <w:pPr>
@@ -764,6 +810,7 @@
             <w:r>
               <w:rPr>
                 <w:rFonts w:ascii="David" w:hAnsi="David"/>
+                <w:b w:val="0"/>
                 <w:sz w:val="20"/>
                 <w:rtl/>
               </w:rPr>
@@ -784,6 +831,7 @@
             <w:r>
               <w:rPr>
                 <w:rFonts w:ascii="David" w:hAnsi="David"/>
+                <w:b w:val="0"/>
                 <w:sz w:val="20"/>
                 <w:rtl/>
               </w:rPr>
@@ -806,6 +854,7 @@
             <w:r>
               <w:rPr>
                 <w:rFonts w:ascii="David" w:hAnsi="David"/>
+                <w:b w:val="0"/>
                 <w:sz w:val="20"/>
                 <w:rtl/>
               </w:rPr>
@@ -826,6 +875,7 @@
             <w:r>
               <w:rPr>
                 <w:rFonts w:ascii="David" w:hAnsi="David"/>
+                <w:b w:val="0"/>
                 <w:sz w:val="20"/>
                 <w:rtl/>
               </w:rPr>
@@ -848,6 +898,7 @@
             <w:r>
               <w:rPr>
                 <w:rFonts w:ascii="David" w:hAnsi="David"/>
+                <w:b w:val="0"/>
                 <w:sz w:val="20"/>
                 <w:rtl/>
               </w:rPr>
@@ -868,6 +919,7 @@
             <w:r>
               <w:rPr>
                 <w:rFonts w:ascii="David" w:hAnsi="David"/>
+                <w:b w:val="0"/>
                 <w:sz w:val="20"/>
                 <w:rtl/>
               </w:rPr>
@@ -890,6 +942,7 @@
             <w:r>
               <w:rPr>
                 <w:rFonts w:ascii="David" w:hAnsi="David"/>
+                <w:b w:val="0"/>
                 <w:sz w:val="20"/>
                 <w:rtl/>
               </w:rPr>
@@ -910,6 +963,7 @@
             <w:r>
               <w:rPr>
                 <w:rFonts w:ascii="David" w:hAnsi="David"/>
+                <w:b w:val="0"/>
                 <w:sz w:val="20"/>
                 <w:rtl/>
               </w:rPr>
@@ -932,6 +986,7 @@
             <w:r>
               <w:rPr>
                 <w:rFonts w:ascii="David" w:hAnsi="David"/>
+                <w:b w:val="0"/>
                 <w:sz w:val="20"/>
                 <w:rtl/>
               </w:rPr>
@@ -952,6 +1007,7 @@
             <w:r>
               <w:rPr>
                 <w:rFonts w:ascii="David" w:hAnsi="David"/>
+                <w:b w:val="0"/>
                 <w:sz w:val="20"/>
                 <w:rtl/>
               </w:rPr>
@@ -1087,7 +1143,7 @@
                     <pic:cNvPicPr/>
                   </pic:nvPicPr>
                   <pic:blipFill>
-                    <a:blip r:embed="rId9"/>
+                    <a:blip r:embed="rId11"/>
                     <a:stretch>
                       <a:fillRect/>
                     </a:stretch>
@@ -1141,7 +1197,6 @@
         <w:tblStyle w:val="LightGrid-Accent1"/>
         <w:tblW w:type="auto" w:w="0"/>
         <w:tblLook w:firstColumn="1" w:firstRow="1" w:lastColumn="0" w:lastRow="0" w:noHBand="0" w:noVBand="1" w:val="04A0"/>
-        <w:bidiVisual/>
       </w:tblPr>
       <w:tblGrid>
         <w:gridCol w:w="720"/>
@@ -1164,16 +1219,14 @@
           </w:tcPr>
           <w:p>
             <w:pPr>
-              <w:bidi/>
-              <w:jc w:val="right"/>
+              <w:jc w:val="left"/>
             </w:pPr>
             <w:r/>
             <w:r>
               <w:rPr>
-                <w:rFonts w:ascii="David" w:hAnsi="David"/>
+                <w:rFonts w:ascii="Calibri" w:hAnsi="Calibri"/>
                 <w:b/>
                 <w:sz w:val="20"/>
-                <w:rtl/>
               </w:rPr>
               <w:t>decade</w:t>
             </w:r>
@@ -1185,16 +1238,14 @@
           </w:tcPr>
           <w:p>
             <w:pPr>
-              <w:bidi/>
-              <w:jc w:val="right"/>
+              <w:jc w:val="left"/>
             </w:pPr>
             <w:r/>
             <w:r>
               <w:rPr>
-                <w:rFonts w:ascii="David" w:hAnsi="David"/>
+                <w:rFonts w:ascii="Calibri" w:hAnsi="Calibri"/>
                 <w:b/>
                 <w:sz w:val="20"/>
-                <w:rtl/>
               </w:rPr>
               <w:t>titles</w:t>
             </w:r>
@@ -1206,16 +1257,14 @@
           </w:tcPr>
           <w:p>
             <w:pPr>
-              <w:bidi/>
-              <w:jc w:val="right"/>
+              <w:jc w:val="left"/>
             </w:pPr>
             <w:r/>
             <w:r>
               <w:rPr>
-                <w:rFonts w:ascii="David" w:hAnsi="David"/>
+                <w:rFonts w:ascii="Calibri" w:hAnsi="Calibri"/>
                 <w:b/>
                 <w:sz w:val="20"/>
-                <w:rtl/>
               </w:rPr>
               <w:t>Drama</w:t>
             </w:r>
@@ -1227,16 +1276,14 @@
           </w:tcPr>
           <w:p>
             <w:pPr>
-              <w:bidi/>
-              <w:jc w:val="right"/>
+              <w:jc w:val="left"/>
             </w:pPr>
             <w:r/>
             <w:r>
               <w:rPr>
-                <w:rFonts w:ascii="David" w:hAnsi="David"/>
+                <w:rFonts w:ascii="Calibri" w:hAnsi="Calibri"/>
                 <w:b/>
                 <w:sz w:val="20"/>
-                <w:rtl/>
               </w:rPr>
               <w:t>Comedy</w:t>
             </w:r>
@@ -1248,16 +1295,14 @@
           </w:tcPr>
           <w:p>
             <w:pPr>
-              <w:bidi/>
-              <w:jc w:val="right"/>
+              <w:jc w:val="left"/>
             </w:pPr>
             <w:r/>
             <w:r>
               <w:rPr>
-                <w:rFonts w:ascii="David" w:hAnsi="David"/>
+                <w:rFonts w:ascii="Calibri" w:hAnsi="Calibri"/>
                 <w:b/>
                 <w:sz w:val="20"/>
-                <w:rtl/>
               </w:rPr>
               <w:t>Animation</w:t>
             </w:r>
@@ -1269,16 +1314,14 @@
           </w:tcPr>
           <w:p>
             <w:pPr>
-              <w:bidi/>
-              <w:jc w:val="right"/>
+              <w:jc w:val="left"/>
             </w:pPr>
             <w:r/>
             <w:r>
               <w:rPr>
-                <w:rFonts w:ascii="David" w:hAnsi="David"/>
+                <w:rFonts w:ascii="Calibri" w:hAnsi="Calibri"/>
                 <w:b/>
                 <w:sz w:val="20"/>
-                <w:rtl/>
               </w:rPr>
               <w:t>Crime</w:t>
             </w:r>
@@ -1290,16 +1333,14 @@
           </w:tcPr>
           <w:p>
             <w:pPr>
-              <w:bidi/>
-              <w:jc w:val="right"/>
+              <w:jc w:val="left"/>
             </w:pPr>
             <w:r/>
             <w:r>
               <w:rPr>
-                <w:rFonts w:ascii="David" w:hAnsi="David"/>
+                <w:rFonts w:ascii="Calibri" w:hAnsi="Calibri"/>
                 <w:b/>
                 <w:sz w:val="20"/>
-                <w:rtl/>
               </w:rPr>
               <w:t>Action &amp; Adventure</w:t>
             </w:r>
@@ -1311,16 +1352,14 @@
           </w:tcPr>
           <w:p>
             <w:pPr>
-              <w:bidi/>
-              <w:jc w:val="right"/>
+              <w:jc w:val="left"/>
             </w:pPr>
             <w:r/>
             <w:r>
               <w:rPr>
-                <w:rFonts w:ascii="David" w:hAnsi="David"/>
+                <w:rFonts w:ascii="Calibri" w:hAnsi="Calibri"/>
                 <w:b/>
                 <w:sz w:val="20"/>
-                <w:rtl/>
               </w:rPr>
               <w:t>Sci-Fi &amp; Fantasy</w:t>
             </w:r>
@@ -1332,16 +1371,14 @@
           </w:tcPr>
           <w:p>
             <w:pPr>
-              <w:bidi/>
-              <w:jc w:val="right"/>
+              <w:jc w:val="left"/>
             </w:pPr>
             <w:r/>
             <w:r>
               <w:rPr>
-                <w:rFonts w:ascii="David" w:hAnsi="David"/>
+                <w:rFonts w:ascii="Calibri" w:hAnsi="Calibri"/>
                 <w:b/>
                 <w:sz w:val="20"/>
-                <w:rtl/>
               </w:rPr>
               <w:t>Mystery</w:t>
             </w:r>
@@ -1353,16 +1390,14 @@
           </w:tcPr>
           <w:p>
             <w:pPr>
-              <w:bidi/>
-              <w:jc w:val="right"/>
+              <w:jc w:val="left"/>
             </w:pPr>
             <w:r/>
             <w:r>
               <w:rPr>
-                <w:rFonts w:ascii="David" w:hAnsi="David"/>
+                <w:rFonts w:ascii="Calibri" w:hAnsi="Calibri"/>
                 <w:b/>
                 <w:sz w:val="20"/>
-                <w:rtl/>
               </w:rPr>
               <w:t>Documentary</w:t>
             </w:r>
@@ -1374,16 +1409,14 @@
           </w:tcPr>
           <w:p>
             <w:pPr>
-              <w:bidi/>
-              <w:jc w:val="right"/>
+              <w:jc w:val="left"/>
             </w:pPr>
             <w:r/>
             <w:r>
               <w:rPr>
-                <w:rFonts w:ascii="David" w:hAnsi="David"/>
+                <w:rFonts w:ascii="Calibri" w:hAnsi="Calibri"/>
                 <w:b/>
                 <w:sz w:val="20"/>
-                <w:rtl/>
               </w:rPr>
               <w:t>Family</w:t>
             </w:r>
@@ -1395,16 +1428,14 @@
           </w:tcPr>
           <w:p>
             <w:pPr>
-              <w:bidi/>
-              <w:jc w:val="right"/>
+              <w:jc w:val="left"/>
             </w:pPr>
             <w:r/>
             <w:r>
               <w:rPr>
-                <w:rFonts w:ascii="David" w:hAnsi="David"/>
+                <w:rFonts w:ascii="Calibri" w:hAnsi="Calibri"/>
                 <w:b/>
                 <w:sz w:val="20"/>
-                <w:rtl/>
               </w:rPr>
               <w:t>Romance</w:t>
             </w:r>
@@ -1418,15 +1449,14 @@
           </w:tcPr>
           <w:p>
             <w:pPr>
-              <w:bidi/>
-              <w:jc w:val="right"/>
+              <w:jc w:val="left"/>
             </w:pPr>
             <w:r/>
             <w:r>
               <w:rPr>
-                <w:rFonts w:ascii="David" w:hAnsi="David"/>
+                <w:rFonts w:ascii="Calibri" w:hAnsi="Calibri"/>
+                <w:b w:val="0"/>
                 <w:sz w:val="20"/>
-                <w:rtl/>
               </w:rPr>
               <w:t>1980s</w:t>
             </w:r>
@@ -1438,15 +1468,14 @@
           </w:tcPr>
           <w:p>
             <w:pPr>
-              <w:bidi/>
-              <w:jc w:val="right"/>
+              <w:jc w:val="left"/>
             </w:pPr>
             <w:r/>
             <w:r>
               <w:rPr>
-                <w:rFonts w:ascii="David" w:hAnsi="David"/>
+                <w:rFonts w:ascii="Calibri" w:hAnsi="Calibri"/>
+                <w:b w:val="0"/>
                 <w:sz w:val="20"/>
-                <w:rtl/>
               </w:rPr>
               <w:t>462</w:t>
             </w:r>
@@ -1458,15 +1487,14 @@
           </w:tcPr>
           <w:p>
             <w:pPr>
-              <w:bidi/>
-              <w:jc w:val="right"/>
+              <w:jc w:val="left"/>
             </w:pPr>
             <w:r/>
             <w:r>
               <w:rPr>
-                <w:rFonts w:ascii="David" w:hAnsi="David"/>
+                <w:rFonts w:ascii="Calibri" w:hAnsi="Calibri"/>
+                <w:b w:val="0"/>
                 <w:sz w:val="20"/>
-                <w:rtl/>
               </w:rPr>
               <w:t>35.3</w:t>
             </w:r>
@@ -1478,15 +1506,14 @@
           </w:tcPr>
           <w:p>
             <w:pPr>
-              <w:bidi/>
-              <w:jc w:val="right"/>
+              <w:jc w:val="left"/>
             </w:pPr>
             <w:r/>
             <w:r>
               <w:rPr>
-                <w:rFonts w:ascii="David" w:hAnsi="David"/>
+                <w:rFonts w:ascii="Calibri" w:hAnsi="Calibri"/>
+                <w:b w:val="0"/>
                 <w:sz w:val="20"/>
-                <w:rtl/>
               </w:rPr>
               <w:t>34.8</w:t>
             </w:r>
@@ -1498,15 +1525,14 @@
           </w:tcPr>
           <w:p>
             <w:pPr>
-              <w:bidi/>
-              <w:jc w:val="right"/>
+              <w:jc w:val="left"/>
             </w:pPr>
             <w:r/>
             <w:r>
               <w:rPr>
-                <w:rFonts w:ascii="David" w:hAnsi="David"/>
+                <w:rFonts w:ascii="Calibri" w:hAnsi="Calibri"/>
+                <w:b w:val="0"/>
                 <w:sz w:val="20"/>
-                <w:rtl/>
               </w:rPr>
               <w:t>32.9</w:t>
             </w:r>
@@ -1518,15 +1544,14 @@
           </w:tcPr>
           <w:p>
             <w:pPr>
-              <w:bidi/>
-              <w:jc w:val="right"/>
+              <w:jc w:val="left"/>
             </w:pPr>
             <w:r/>
             <w:r>
               <w:rPr>
-                <w:rFonts w:ascii="David" w:hAnsi="David"/>
+                <w:rFonts w:ascii="Calibri" w:hAnsi="Calibri"/>
+                <w:b w:val="0"/>
                 <w:sz w:val="20"/>
-                <w:rtl/>
               </w:rPr>
               <w:t>11.7</w:t>
             </w:r>
@@ -1538,15 +1563,14 @@
           </w:tcPr>
           <w:p>
             <w:pPr>
-              <w:bidi/>
-              <w:jc w:val="right"/>
+              <w:jc w:val="left"/>
             </w:pPr>
             <w:r/>
             <w:r>
               <w:rPr>
-                <w:rFonts w:ascii="David" w:hAnsi="David"/>
+                <w:rFonts w:ascii="Calibri" w:hAnsi="Calibri"/>
+                <w:b w:val="0"/>
                 <w:sz w:val="20"/>
-                <w:rtl/>
               </w:rPr>
               <w:t>18.8</w:t>
             </w:r>
@@ -1558,15 +1582,14 @@
           </w:tcPr>
           <w:p>
             <w:pPr>
-              <w:bidi/>
-              <w:jc w:val="right"/>
+              <w:jc w:val="left"/>
             </w:pPr>
             <w:r/>
             <w:r>
               <w:rPr>
-                <w:rFonts w:ascii="David" w:hAnsi="David"/>
+                <w:rFonts w:ascii="Calibri" w:hAnsi="Calibri"/>
+                <w:b w:val="0"/>
                 <w:sz w:val="20"/>
-                <w:rtl/>
               </w:rPr>
               <w:t>18.0</w:t>
             </w:r>
@@ -1578,15 +1601,14 @@
           </w:tcPr>
           <w:p>
             <w:pPr>
-              <w:bidi/>
-              <w:jc w:val="right"/>
+              <w:jc w:val="left"/>
             </w:pPr>
             <w:r/>
             <w:r>
               <w:rPr>
-                <w:rFonts w:ascii="David" w:hAnsi="David"/>
+                <w:rFonts w:ascii="Calibri" w:hAnsi="Calibri"/>
+                <w:b w:val="0"/>
                 <w:sz w:val="20"/>
-                <w:rtl/>
               </w:rPr>
               <w:t>9.1</w:t>
             </w:r>
@@ -1598,15 +1620,14 @@
           </w:tcPr>
           <w:p>
             <w:pPr>
-              <w:bidi/>
-              <w:jc w:val="right"/>
+              <w:jc w:val="left"/>
             </w:pPr>
             <w:r/>
             <w:r>
               <w:rPr>
-                <w:rFonts w:ascii="David" w:hAnsi="David"/>
+                <w:rFonts w:ascii="Calibri" w:hAnsi="Calibri"/>
+                <w:b w:val="0"/>
                 <w:sz w:val="20"/>
-                <w:rtl/>
               </w:rPr>
               <w:t>3.9</w:t>
             </w:r>
@@ -1618,15 +1639,14 @@
           </w:tcPr>
           <w:p>
             <w:pPr>
-              <w:bidi/>
-              <w:jc w:val="right"/>
+              <w:jc w:val="left"/>
             </w:pPr>
             <w:r/>
             <w:r>
               <w:rPr>
-                <w:rFonts w:ascii="David" w:hAnsi="David"/>
+                <w:rFonts w:ascii="Calibri" w:hAnsi="Calibri"/>
+                <w:b w:val="0"/>
                 <w:sz w:val="20"/>
-                <w:rtl/>
               </w:rPr>
               <w:t>15.6</w:t>
             </w:r>
@@ -1638,15 +1658,14 @@
           </w:tcPr>
           <w:p>
             <w:pPr>
-              <w:bidi/>
-              <w:jc w:val="right"/>
+              <w:jc w:val="left"/>
             </w:pPr>
             <w:r/>
             <w:r>
               <w:rPr>
-                <w:rFonts w:ascii="David" w:hAnsi="David"/>
+                <w:rFonts w:ascii="Calibri" w:hAnsi="Calibri"/>
+                <w:b w:val="0"/>
                 <w:sz w:val="20"/>
-                <w:rtl/>
               </w:rPr>
               <w:t>1.7</w:t>
             </w:r>
@@ -1660,15 +1679,14 @@
           </w:tcPr>
           <w:p>
             <w:pPr>
-              <w:bidi/>
-              <w:jc w:val="right"/>
+              <w:jc w:val="left"/>
             </w:pPr>
             <w:r/>
             <w:r>
               <w:rPr>
-                <w:rFonts w:ascii="David" w:hAnsi="David"/>
+                <w:rFonts w:ascii="Calibri" w:hAnsi="Calibri"/>
+                <w:b w:val="0"/>
                 <w:sz w:val="20"/>
-                <w:rtl/>
               </w:rPr>
               <w:t>1990s</w:t>
             </w:r>
@@ -1680,15 +1698,14 @@
           </w:tcPr>
           <w:p>
             <w:pPr>
-              <w:bidi/>
-              <w:jc w:val="right"/>
+              <w:jc w:val="left"/>
             </w:pPr>
             <w:r/>
             <w:r>
               <w:rPr>
-                <w:rFonts w:ascii="David" w:hAnsi="David"/>
+                <w:rFonts w:ascii="Calibri" w:hAnsi="Calibri"/>
+                <w:b w:val="0"/>
                 <w:sz w:val="20"/>
-                <w:rtl/>
               </w:rPr>
               <w:t>782</w:t>
             </w:r>
@@ -1700,15 +1717,14 @@
           </w:tcPr>
           <w:p>
             <w:pPr>
-              <w:bidi/>
-              <w:jc w:val="right"/>
+              <w:jc w:val="left"/>
             </w:pPr>
             <w:r/>
             <w:r>
               <w:rPr>
-                <w:rFonts w:ascii="David" w:hAnsi="David"/>
+                <w:rFonts w:ascii="Calibri" w:hAnsi="Calibri"/>
+                <w:b w:val="0"/>
                 <w:sz w:val="20"/>
-                <w:rtl/>
               </w:rPr>
               <w:t>37.3</w:t>
             </w:r>
@@ -1720,15 +1736,14 @@
           </w:tcPr>
           <w:p>
             <w:pPr>
-              <w:bidi/>
-              <w:jc w:val="right"/>
+              <w:jc w:val="left"/>
             </w:pPr>
             <w:r/>
             <w:r>
               <w:rPr>
-                <w:rFonts w:ascii="David" w:hAnsi="David"/>
+                <w:rFonts w:ascii="Calibri" w:hAnsi="Calibri"/>
+                <w:b w:val="0"/>
                 <w:sz w:val="20"/>
-                <w:rtl/>
               </w:rPr>
               <w:t>43.1</w:t>
             </w:r>
@@ -1740,15 +1755,14 @@
           </w:tcPr>
           <w:p>
             <w:pPr>
-              <w:bidi/>
-              <w:jc w:val="right"/>
+              <w:jc w:val="left"/>
             </w:pPr>
             <w:r/>
             <w:r>
               <w:rPr>
-                <w:rFonts w:ascii="David" w:hAnsi="David"/>
+                <w:rFonts w:ascii="Calibri" w:hAnsi="Calibri"/>
+                <w:b w:val="0"/>
                 <w:sz w:val="20"/>
-                <w:rtl/>
               </w:rPr>
               <w:t>32.4</w:t>
             </w:r>
@@ -1760,15 +1774,14 @@
           </w:tcPr>
           <w:p>
             <w:pPr>
-              <w:bidi/>
-              <w:jc w:val="right"/>
+              <w:jc w:val="left"/>
             </w:pPr>
             <w:r/>
             <w:r>
               <w:rPr>
-                <w:rFonts w:ascii="David" w:hAnsi="David"/>
+                <w:rFonts w:ascii="Calibri" w:hAnsi="Calibri"/>
+                <w:b w:val="0"/>
                 <w:sz w:val="20"/>
-                <w:rtl/>
               </w:rPr>
               <w:t>7.9</w:t>
             </w:r>
@@ -1780,15 +1793,14 @@
           </w:tcPr>
           <w:p>
             <w:pPr>
-              <w:bidi/>
-              <w:jc w:val="right"/>
+              <w:jc w:val="left"/>
             </w:pPr>
             <w:r/>
             <w:r>
               <w:rPr>
-                <w:rFonts w:ascii="David" w:hAnsi="David"/>
+                <w:rFonts w:ascii="Calibri" w:hAnsi="Calibri"/>
+                <w:b w:val="0"/>
                 <w:sz w:val="20"/>
-                <w:rtl/>
               </w:rPr>
               <w:t>19.2</w:t>
             </w:r>
@@ -1800,15 +1812,14 @@
           </w:tcPr>
           <w:p>
             <w:pPr>
-              <w:bidi/>
-              <w:jc w:val="right"/>
+              <w:jc w:val="left"/>
             </w:pPr>
             <w:r/>
             <w:r>
               <w:rPr>
-                <w:rFonts w:ascii="David" w:hAnsi="David"/>
+                <w:rFonts w:ascii="Calibri" w:hAnsi="Calibri"/>
+                <w:b w:val="0"/>
                 <w:sz w:val="20"/>
-                <w:rtl/>
               </w:rPr>
               <w:t>17.1</w:t>
             </w:r>
@@ -1820,15 +1831,14 @@
           </w:tcPr>
           <w:p>
             <w:pPr>
-              <w:bidi/>
-              <w:jc w:val="right"/>
+              <w:jc w:val="left"/>
             </w:pPr>
             <w:r/>
             <w:r>
               <w:rPr>
-                <w:rFonts w:ascii="David" w:hAnsi="David"/>
+                <w:rFonts w:ascii="Calibri" w:hAnsi="Calibri"/>
+                <w:b w:val="0"/>
                 <w:sz w:val="20"/>
-                <w:rtl/>
               </w:rPr>
               <w:t>5.5</w:t>
             </w:r>
@@ -1840,15 +1850,14 @@
           </w:tcPr>
           <w:p>
             <w:pPr>
-              <w:bidi/>
-              <w:jc w:val="right"/>
+              <w:jc w:val="left"/>
             </w:pPr>
             <w:r/>
             <w:r>
               <w:rPr>
-                <w:rFonts w:ascii="David" w:hAnsi="David"/>
+                <w:rFonts w:ascii="Calibri" w:hAnsi="Calibri"/>
+                <w:b w:val="0"/>
                 <w:sz w:val="20"/>
-                <w:rtl/>
               </w:rPr>
               <w:t>4.9</w:t>
             </w:r>
@@ -1860,15 +1869,14 @@
           </w:tcPr>
           <w:p>
             <w:pPr>
-              <w:bidi/>
-              <w:jc w:val="right"/>
+              <w:jc w:val="left"/>
             </w:pPr>
             <w:r/>
             <w:r>
               <w:rPr>
-                <w:rFonts w:ascii="David" w:hAnsi="David"/>
+                <w:rFonts w:ascii="Calibri" w:hAnsi="Calibri"/>
+                <w:b w:val="0"/>
                 <w:sz w:val="20"/>
-                <w:rtl/>
               </w:rPr>
               <w:t>12.5</w:t>
             </w:r>
@@ -1880,15 +1888,14 @@
           </w:tcPr>
           <w:p>
             <w:pPr>
-              <w:bidi/>
-              <w:jc w:val="right"/>
+              <w:jc w:val="left"/>
             </w:pPr>
             <w:r/>
             <w:r>
               <w:rPr>
-                <w:rFonts w:ascii="David" w:hAnsi="David"/>
+                <w:rFonts w:ascii="Calibri" w:hAnsi="Calibri"/>
+                <w:b w:val="0"/>
                 <w:sz w:val="20"/>
-                <w:rtl/>
               </w:rPr>
               <w:t>2.4</w:t>
             </w:r>
@@ -1902,15 +1909,14 @@
           </w:tcPr>
           <w:p>
             <w:pPr>
-              <w:bidi/>
-              <w:jc w:val="right"/>
+              <w:jc w:val="left"/>
             </w:pPr>
             <w:r/>
             <w:r>
               <w:rPr>
-                <w:rFonts w:ascii="David" w:hAnsi="David"/>
+                <w:rFonts w:ascii="Calibri" w:hAnsi="Calibri"/>
+                <w:b w:val="0"/>
                 <w:sz w:val="20"/>
-                <w:rtl/>
               </w:rPr>
               <w:t>2000s</w:t>
             </w:r>
@@ -1922,15 +1928,14 @@
           </w:tcPr>
           <w:p>
             <w:pPr>
-              <w:bidi/>
-              <w:jc w:val="right"/>
+              <w:jc w:val="left"/>
             </w:pPr>
             <w:r/>
             <w:r>
               <w:rPr>
-                <w:rFonts w:ascii="David" w:hAnsi="David"/>
+                <w:rFonts w:ascii="Calibri" w:hAnsi="Calibri"/>
+                <w:b w:val="0"/>
                 <w:sz w:val="20"/>
-                <w:rtl/>
               </w:rPr>
               <w:t>1692</w:t>
             </w:r>
@@ -1942,15 +1947,14 @@
           </w:tcPr>
           <w:p>
             <w:pPr>
-              <w:bidi/>
-              <w:jc w:val="right"/>
+              <w:jc w:val="left"/>
             </w:pPr>
             <w:r/>
             <w:r>
               <w:rPr>
-                <w:rFonts w:ascii="David" w:hAnsi="David"/>
+                <w:rFonts w:ascii="Calibri" w:hAnsi="Calibri"/>
+                <w:b w:val="0"/>
                 <w:sz w:val="20"/>
-                <w:rtl/>
               </w:rPr>
               <w:t>44.7</w:t>
             </w:r>
@@ -1962,15 +1966,14 @@
           </w:tcPr>
           <w:p>
             <w:pPr>
-              <w:bidi/>
-              <w:jc w:val="right"/>
+              <w:jc w:val="left"/>
             </w:pPr>
             <w:r/>
             <w:r>
               <w:rPr>
-                <w:rFonts w:ascii="David" w:hAnsi="David"/>
+                <w:rFonts w:ascii="Calibri" w:hAnsi="Calibri"/>
+                <w:b w:val="0"/>
                 <w:sz w:val="20"/>
-                <w:rtl/>
               </w:rPr>
               <w:t>40.7</w:t>
             </w:r>
@@ -1982,15 +1985,14 @@
           </w:tcPr>
           <w:p>
             <w:pPr>
-              <w:bidi/>
-              <w:jc w:val="right"/>
+              <w:jc w:val="left"/>
             </w:pPr>
             <w:r/>
             <w:r>
               <w:rPr>
-                <w:rFonts w:ascii="David" w:hAnsi="David"/>
+                <w:rFonts w:ascii="Calibri" w:hAnsi="Calibri"/>
+                <w:b w:val="0"/>
                 <w:sz w:val="20"/>
-                <w:rtl/>
               </w:rPr>
               <w:t>28.8</w:t>
             </w:r>
@@ -2002,15 +2004,14 @@
           </w:tcPr>
           <w:p>
             <w:pPr>
-              <w:bidi/>
-              <w:jc w:val="right"/>
+              <w:jc w:val="left"/>
             </w:pPr>
             <w:r/>
             <w:r>
               <w:rPr>
-                <w:rFonts w:ascii="David" w:hAnsi="David"/>
+                <w:rFonts w:ascii="Calibri" w:hAnsi="Calibri"/>
+                <w:b w:val="0"/>
                 <w:sz w:val="20"/>
-                <w:rtl/>
               </w:rPr>
               <w:t>8.5</w:t>
             </w:r>
@@ -2022,15 +2023,14 @@
           </w:tcPr>
           <w:p>
             <w:pPr>
-              <w:bidi/>
-              <w:jc w:val="right"/>
+              <w:jc w:val="left"/>
             </w:pPr>
             <w:r/>
             <w:r>
               <w:rPr>
-                <w:rFonts w:ascii="David" w:hAnsi="David"/>
+                <w:rFonts w:ascii="Calibri" w:hAnsi="Calibri"/>
+                <w:b w:val="0"/>
                 <w:sz w:val="20"/>
-                <w:rtl/>
               </w:rPr>
               <w:t>14.8</w:t>
             </w:r>
@@ -2042,15 +2042,14 @@
           </w:tcPr>
           <w:p>
             <w:pPr>
-              <w:bidi/>
-              <w:jc w:val="right"/>
+              <w:jc w:val="left"/>
             </w:pPr>
             <w:r/>
             <w:r>
               <w:rPr>
-                <w:rFonts w:ascii="David" w:hAnsi="David"/>
+                <w:rFonts w:ascii="Calibri" w:hAnsi="Calibri"/>
+                <w:b w:val="0"/>
                 <w:sz w:val="20"/>
-                <w:rtl/>
               </w:rPr>
               <w:t>13.4</w:t>
             </w:r>
@@ -2062,15 +2061,14 @@
           </w:tcPr>
           <w:p>
             <w:pPr>
-              <w:bidi/>
-              <w:jc w:val="right"/>
+              <w:jc w:val="left"/>
             </w:pPr>
             <w:r/>
             <w:r>
               <w:rPr>
-                <w:rFonts w:ascii="David" w:hAnsi="David"/>
+                <w:rFonts w:ascii="Calibri" w:hAnsi="Calibri"/>
+                <w:b w:val="0"/>
                 <w:sz w:val="20"/>
-                <w:rtl/>
               </w:rPr>
               <w:t>8.3</w:t>
             </w:r>
@@ -2082,15 +2080,14 @@
           </w:tcPr>
           <w:p>
             <w:pPr>
-              <w:bidi/>
-              <w:jc w:val="right"/>
+              <w:jc w:val="left"/>
             </w:pPr>
             <w:r/>
             <w:r>
               <w:rPr>
-                <w:rFonts w:ascii="David" w:hAnsi="David"/>
+                <w:rFonts w:ascii="Calibri" w:hAnsi="Calibri"/>
+                <w:b w:val="0"/>
                 <w:sz w:val="20"/>
-                <w:rtl/>
               </w:rPr>
               <w:t>7.0</w:t>
             </w:r>
@@ -2102,15 +2099,14 @@
           </w:tcPr>
           <w:p>
             <w:pPr>
-              <w:bidi/>
-              <w:jc w:val="right"/>
+              <w:jc w:val="left"/>
             </w:pPr>
             <w:r/>
             <w:r>
               <w:rPr>
-                <w:rFonts w:ascii="David" w:hAnsi="David"/>
+                <w:rFonts w:ascii="Calibri" w:hAnsi="Calibri"/>
+                <w:b w:val="0"/>
                 <w:sz w:val="20"/>
-                <w:rtl/>
               </w:rPr>
               <w:t>8.2</w:t>
             </w:r>
@@ -2122,15 +2118,14 @@
           </w:tcPr>
           <w:p>
             <w:pPr>
-              <w:bidi/>
-              <w:jc w:val="right"/>
+              <w:jc w:val="left"/>
             </w:pPr>
             <w:r/>
             <w:r>
               <w:rPr>
-                <w:rFonts w:ascii="David" w:hAnsi="David"/>
+                <w:rFonts w:ascii="Calibri" w:hAnsi="Calibri"/>
+                <w:b w:val="0"/>
                 <w:sz w:val="20"/>
-                <w:rtl/>
               </w:rPr>
               <w:t>2.8</w:t>
             </w:r>
@@ -2144,15 +2139,14 @@
           </w:tcPr>
           <w:p>
             <w:pPr>
-              <w:bidi/>
-              <w:jc w:val="right"/>
+              <w:jc w:val="left"/>
             </w:pPr>
             <w:r/>
             <w:r>
               <w:rPr>
-                <w:rFonts w:ascii="David" w:hAnsi="David"/>
+                <w:rFonts w:ascii="Calibri" w:hAnsi="Calibri"/>
+                <w:b w:val="0"/>
                 <w:sz w:val="20"/>
-                <w:rtl/>
               </w:rPr>
               <w:t>2010s</w:t>
             </w:r>
@@ -2164,15 +2158,14 @@
           </w:tcPr>
           <w:p>
             <w:pPr>
-              <w:bidi/>
-              <w:jc w:val="right"/>
+              <w:jc w:val="left"/>
             </w:pPr>
             <w:r/>
             <w:r>
               <w:rPr>
-                <w:rFonts w:ascii="David" w:hAnsi="David"/>
+                <w:rFonts w:ascii="Calibri" w:hAnsi="Calibri"/>
+                <w:b w:val="0"/>
                 <w:sz w:val="20"/>
-                <w:rtl/>
               </w:rPr>
               <w:t>4801</w:t>
             </w:r>
@@ -2184,15 +2177,14 @@
           </w:tcPr>
           <w:p>
             <w:pPr>
-              <w:bidi/>
-              <w:jc w:val="right"/>
+              <w:jc w:val="left"/>
             </w:pPr>
             <w:r/>
             <w:r>
               <w:rPr>
-                <w:rFonts w:ascii="David" w:hAnsi="David"/>
+                <w:rFonts w:ascii="Calibri" w:hAnsi="Calibri"/>
+                <w:b w:val="0"/>
                 <w:sz w:val="20"/>
-                <w:rtl/>
               </w:rPr>
               <w:t>50.7</w:t>
             </w:r>
@@ -2204,15 +2196,14 @@
           </w:tcPr>
           <w:p>
             <w:pPr>
-              <w:bidi/>
-              <w:jc w:val="right"/>
+              <w:jc w:val="left"/>
             </w:pPr>
             <w:r/>
             <w:r>
               <w:rPr>
-                <w:rFonts w:ascii="David" w:hAnsi="David"/>
+                <w:rFonts w:ascii="Calibri" w:hAnsi="Calibri"/>
+                <w:b w:val="0"/>
                 <w:sz w:val="20"/>
-                <w:rtl/>
               </w:rPr>
               <w:t>36.0</w:t>
             </w:r>
@@ -2224,15 +2215,14 @@
           </w:tcPr>
           <w:p>
             <w:pPr>
-              <w:bidi/>
-              <w:jc w:val="right"/>
+              <w:jc w:val="left"/>
             </w:pPr>
             <w:r/>
             <w:r>
               <w:rPr>
-                <w:rFonts w:ascii="David" w:hAnsi="David"/>
+                <w:rFonts w:ascii="Calibri" w:hAnsi="Calibri"/>
+                <w:b w:val="0"/>
                 <w:sz w:val="20"/>
-                <w:rtl/>
               </w:rPr>
               <w:t>22.1</w:t>
             </w:r>
@@ -2244,15 +2234,14 @@
           </w:tcPr>
           <w:p>
             <w:pPr>
-              <w:bidi/>
-              <w:jc w:val="right"/>
+              <w:jc w:val="left"/>
             </w:pPr>
             <w:r/>
             <w:r>
               <w:rPr>
-                <w:rFonts w:ascii="David" w:hAnsi="David"/>
+                <w:rFonts w:ascii="Calibri" w:hAnsi="Calibri"/>
+                <w:b w:val="0"/>
                 <w:sz w:val="20"/>
-                <w:rtl/>
               </w:rPr>
               <w:t>15.8</w:t>
             </w:r>
@@ -2264,15 +2253,14 @@
           </w:tcPr>
           <w:p>
             <w:pPr>
-              <w:bidi/>
-              <w:jc w:val="right"/>
+              <w:jc w:val="left"/>
             </w:pPr>
             <w:r/>
             <w:r>
               <w:rPr>
-                <w:rFonts w:ascii="David" w:hAnsi="David"/>
+                <w:rFonts w:ascii="Calibri" w:hAnsi="Calibri"/>
+                <w:b w:val="0"/>
                 <w:sz w:val="20"/>
-                <w:rtl/>
               </w:rPr>
               <w:t>12.1</w:t>
             </w:r>
@@ -2284,15 +2272,14 @@
           </w:tcPr>
           <w:p>
             <w:pPr>
-              <w:bidi/>
-              <w:jc w:val="right"/>
+              <w:jc w:val="left"/>
             </w:pPr>
             <w:r/>
             <w:r>
               <w:rPr>
-                <w:rFonts w:ascii="David" w:hAnsi="David"/>
+                <w:rFonts w:ascii="Calibri" w:hAnsi="Calibri"/>
+                <w:b w:val="0"/>
                 <w:sz w:val="20"/>
-                <w:rtl/>
               </w:rPr>
               <w:t>12.1</w:t>
             </w:r>
@@ -2304,15 +2291,14 @@
           </w:tcPr>
           <w:p>
             <w:pPr>
-              <w:bidi/>
-              <w:jc w:val="right"/>
+              <w:jc w:val="left"/>
             </w:pPr>
             <w:r/>
             <w:r>
               <w:rPr>
-                <w:rFonts w:ascii="David" w:hAnsi="David"/>
+                <w:rFonts w:ascii="Calibri" w:hAnsi="Calibri"/>
+                <w:b w:val="0"/>
                 <w:sz w:val="20"/>
-                <w:rtl/>
               </w:rPr>
               <w:t>10.7</w:t>
             </w:r>
@@ -2324,15 +2310,14 @@
           </w:tcPr>
           <w:p>
             <w:pPr>
-              <w:bidi/>
-              <w:jc w:val="right"/>
+              <w:jc w:val="left"/>
             </w:pPr>
             <w:r/>
             <w:r>
               <w:rPr>
-                <w:rFonts w:ascii="David" w:hAnsi="David"/>
+                <w:rFonts w:ascii="Calibri" w:hAnsi="Calibri"/>
+                <w:b w:val="0"/>
                 <w:sz w:val="20"/>
-                <w:rtl/>
               </w:rPr>
               <w:t>7.9</w:t>
             </w:r>
@@ -2344,15 +2329,14 @@
           </w:tcPr>
           <w:p>
             <w:pPr>
-              <w:bidi/>
-              <w:jc w:val="right"/>
+              <w:jc w:val="left"/>
             </w:pPr>
             <w:r/>
             <w:r>
               <w:rPr>
-                <w:rFonts w:ascii="David" w:hAnsi="David"/>
+                <w:rFonts w:ascii="Calibri" w:hAnsi="Calibri"/>
+                <w:b w:val="0"/>
                 <w:sz w:val="20"/>
-                <w:rtl/>
               </w:rPr>
               <w:t>5.1</w:t>
             </w:r>
@@ -2364,15 +2348,14 @@
           </w:tcPr>
           <w:p>
             <w:pPr>
-              <w:bidi/>
-              <w:jc w:val="right"/>
+              <w:jc w:val="left"/>
             </w:pPr>
             <w:r/>
             <w:r>
               <w:rPr>
-                <w:rFonts w:ascii="David" w:hAnsi="David"/>
+                <w:rFonts w:ascii="Calibri" w:hAnsi="Calibri"/>
+                <w:b w:val="0"/>
                 <w:sz w:val="20"/>
-                <w:rtl/>
               </w:rPr>
               <w:t>2.4</w:t>
             </w:r>
@@ -2386,15 +2369,14 @@
           </w:tcPr>
           <w:p>
             <w:pPr>
-              <w:bidi/>
-              <w:jc w:val="right"/>
+              <w:jc w:val="left"/>
             </w:pPr>
             <w:r/>
             <w:r>
               <w:rPr>
-                <w:rFonts w:ascii="David" w:hAnsi="David"/>
+                <w:rFonts w:ascii="Calibri" w:hAnsi="Calibri"/>
+                <w:b w:val="0"/>
                 <w:sz w:val="20"/>
-                <w:rtl/>
               </w:rPr>
               <w:t>2020s</w:t>
             </w:r>
@@ -2406,15 +2388,14 @@
           </w:tcPr>
           <w:p>
             <w:pPr>
-              <w:bidi/>
-              <w:jc w:val="right"/>
+              <w:jc w:val="left"/>
             </w:pPr>
             <w:r/>
             <w:r>
               <w:rPr>
-                <w:rFonts w:ascii="David" w:hAnsi="David"/>
+                <w:rFonts w:ascii="Calibri" w:hAnsi="Calibri"/>
+                <w:b w:val="0"/>
                 <w:sz w:val="20"/>
-                <w:rtl/>
               </w:rPr>
               <w:t>2779</w:t>
             </w:r>
@@ -2426,15 +2407,14 @@
           </w:tcPr>
           <w:p>
             <w:pPr>
-              <w:bidi/>
-              <w:jc w:val="right"/>
+              <w:jc w:val="left"/>
             </w:pPr>
             <w:r/>
             <w:r>
               <w:rPr>
-                <w:rFonts w:ascii="David" w:hAnsi="David"/>
+                <w:rFonts w:ascii="Calibri" w:hAnsi="Calibri"/>
+                <w:b w:val="0"/>
                 <w:sz w:val="20"/>
-                <w:rtl/>
               </w:rPr>
               <w:t>56.4</w:t>
             </w:r>
@@ -2446,15 +2426,14 @@
           </w:tcPr>
           <w:p>
             <w:pPr>
-              <w:bidi/>
-              <w:jc w:val="right"/>
+              <w:jc w:val="left"/>
             </w:pPr>
             <w:r/>
             <w:r>
               <w:rPr>
-                <w:rFonts w:ascii="David" w:hAnsi="David"/>
+                <w:rFonts w:ascii="Calibri" w:hAnsi="Calibri"/>
+                <w:b w:val="0"/>
                 <w:sz w:val="20"/>
-                <w:rtl/>
               </w:rPr>
               <w:t>27.7</w:t>
             </w:r>
@@ -2466,15 +2445,14 @@
           </w:tcPr>
           <w:p>
             <w:pPr>
-              <w:bidi/>
-              <w:jc w:val="right"/>
+              <w:jc w:val="left"/>
             </w:pPr>
             <w:r/>
             <w:r>
               <w:rPr>
-                <w:rFonts w:ascii="David" w:hAnsi="David"/>
+                <w:rFonts w:ascii="Calibri" w:hAnsi="Calibri"/>
+                <w:b w:val="0"/>
                 <w:sz w:val="20"/>
-                <w:rtl/>
               </w:rPr>
               <w:t>17.8</w:t>
             </w:r>
@@ -2486,15 +2464,14 @@
           </w:tcPr>
           <w:p>
             <w:pPr>
-              <w:bidi/>
-              <w:jc w:val="right"/>
+              <w:jc w:val="left"/>
             </w:pPr>
             <w:r/>
             <w:r>
               <w:rPr>
-                <w:rFonts w:ascii="David" w:hAnsi="David"/>
+                <w:rFonts w:ascii="Calibri" w:hAnsi="Calibri"/>
+                <w:b w:val="0"/>
                 <w:sz w:val="20"/>
-                <w:rtl/>
               </w:rPr>
               <w:t>19.8</w:t>
             </w:r>
@@ -2506,15 +2483,14 @@
           </w:tcPr>
           <w:p>
             <w:pPr>
-              <w:bidi/>
-              <w:jc w:val="right"/>
+              <w:jc w:val="left"/>
             </w:pPr>
             <w:r/>
             <w:r>
               <w:rPr>
-                <w:rFonts w:ascii="David" w:hAnsi="David"/>
+                <w:rFonts w:ascii="Calibri" w:hAnsi="Calibri"/>
+                <w:b w:val="0"/>
                 <w:sz w:val="20"/>
-                <w:rtl/>
               </w:rPr>
               <w:t>10.5</w:t>
             </w:r>
@@ -2526,15 +2502,14 @@
           </w:tcPr>
           <w:p>
             <w:pPr>
-              <w:bidi/>
-              <w:jc w:val="right"/>
+              <w:jc w:val="left"/>
             </w:pPr>
             <w:r/>
             <w:r>
               <w:rPr>
-                <w:rFonts w:ascii="David" w:hAnsi="David"/>
+                <w:rFonts w:ascii="Calibri" w:hAnsi="Calibri"/>
+                <w:b w:val="0"/>
                 <w:sz w:val="20"/>
-                <w:rtl/>
               </w:rPr>
               <w:t>12.0</w:t>
             </w:r>
@@ -2546,15 +2521,14 @@
           </w:tcPr>
           <w:p>
             <w:pPr>
-              <w:bidi/>
-              <w:jc w:val="right"/>
+              <w:jc w:val="left"/>
             </w:pPr>
             <w:r/>
             <w:r>
               <w:rPr>
-                <w:rFonts w:ascii="David" w:hAnsi="David"/>
+                <w:rFonts w:ascii="Calibri" w:hAnsi="Calibri"/>
+                <w:b w:val="0"/>
                 <w:sz w:val="20"/>
-                <w:rtl/>
               </w:rPr>
               <w:t>14.8</w:t>
             </w:r>
@@ -2566,15 +2540,14 @@
           </w:tcPr>
           <w:p>
             <w:pPr>
-              <w:bidi/>
-              <w:jc w:val="right"/>
+              <w:jc w:val="left"/>
             </w:pPr>
             <w:r/>
             <w:r>
               <w:rPr>
-                <w:rFonts w:ascii="David" w:hAnsi="David"/>
+                <w:rFonts w:ascii="Calibri" w:hAnsi="Calibri"/>
+                <w:b w:val="0"/>
                 <w:sz w:val="20"/>
-                <w:rtl/>
               </w:rPr>
               <w:t>11.3</w:t>
             </w:r>
@@ -2586,15 +2559,14 @@
           </w:tcPr>
           <w:p>
             <w:pPr>
-              <w:bidi/>
-              <w:jc w:val="right"/>
+              <w:jc w:val="left"/>
             </w:pPr>
             <w:r/>
             <w:r>
               <w:rPr>
-                <w:rFonts w:ascii="David" w:hAnsi="David"/>
+                <w:rFonts w:ascii="Calibri" w:hAnsi="Calibri"/>
+                <w:b w:val="0"/>
                 <w:sz w:val="20"/>
-                <w:rtl/>
               </w:rPr>
               <w:t>3.7</w:t>
             </w:r>
@@ -2606,15 +2578,14 @@
           </w:tcPr>
           <w:p>
             <w:pPr>
-              <w:bidi/>
-              <w:jc w:val="right"/>
+              <w:jc w:val="left"/>
             </w:pPr>
             <w:r/>
             <w:r>
               <w:rPr>
-                <w:rFonts w:ascii="David" w:hAnsi="David"/>
+                <w:rFonts w:ascii="Calibri" w:hAnsi="Calibri"/>
+                <w:b w:val="0"/>
                 <w:sz w:val="20"/>
-                <w:rtl/>
               </w:rPr>
               <w:t>2.8</w:t>
             </w:r>
@@ -2658,7 +2629,6 @@
         <w:tblStyle w:val="LightGrid-Accent1"/>
         <w:tblW w:type="auto" w:w="0"/>
         <w:tblLook w:firstColumn="1" w:firstRow="1" w:lastColumn="0" w:lastRow="0" w:noHBand="0" w:noVBand="1" w:val="04A0"/>
-        <w:bidiVisual/>
       </w:tblPr>
       <w:tblGrid>
         <w:gridCol w:w="1728"/>
@@ -2674,16 +2644,14 @@
           </w:tcPr>
           <w:p>
             <w:pPr>
-              <w:bidi/>
-              <w:jc w:val="right"/>
+              <w:jc w:val="left"/>
             </w:pPr>
             <w:r/>
             <w:r>
               <w:rPr>
-                <w:rFonts w:ascii="David" w:hAnsi="David"/>
+                <w:rFonts w:ascii="Calibri" w:hAnsi="Calibri"/>
                 <w:b/>
                 <w:sz w:val="20"/>
-                <w:rtl/>
               </w:rPr>
               <w:t>decade</w:t>
             </w:r>
@@ -2695,16 +2663,14 @@
           </w:tcPr>
           <w:p>
             <w:pPr>
-              <w:bidi/>
-              <w:jc w:val="right"/>
+              <w:jc w:val="left"/>
             </w:pPr>
             <w:r/>
             <w:r>
               <w:rPr>
-                <w:rFonts w:ascii="David" w:hAnsi="David"/>
+                <w:rFonts w:ascii="Calibri" w:hAnsi="Calibri"/>
                 <w:b/>
                 <w:sz w:val="20"/>
-                <w:rtl/>
               </w:rPr>
               <w:t>titles</w:t>
             </w:r>
@@ -2716,16 +2682,14 @@
           </w:tcPr>
           <w:p>
             <w:pPr>
-              <w:bidi/>
-              <w:jc w:val="right"/>
+              <w:jc w:val="left"/>
             </w:pPr>
             <w:r/>
             <w:r>
               <w:rPr>
-                <w:rFonts w:ascii="David" w:hAnsi="David"/>
+                <w:rFonts w:ascii="Calibri" w:hAnsi="Calibri"/>
                 <w:b/>
                 <w:sz w:val="20"/>
-                <w:rtl/>
               </w:rPr>
               <w:t>avg_rating</w:t>
             </w:r>
@@ -2737,16 +2701,14 @@
           </w:tcPr>
           <w:p>
             <w:pPr>
-              <w:bidi/>
-              <w:jc w:val="right"/>
+              <w:jc w:val="left"/>
             </w:pPr>
             <w:r/>
             <w:r>
               <w:rPr>
-                <w:rFonts w:ascii="David" w:hAnsi="David"/>
+                <w:rFonts w:ascii="Calibri" w:hAnsi="Calibri"/>
                 <w:b/>
                 <w:sz w:val="20"/>
-                <w:rtl/>
               </w:rPr>
               <w:t>median_rating</w:t>
             </w:r>
@@ -2758,16 +2720,14 @@
           </w:tcPr>
           <w:p>
             <w:pPr>
-              <w:bidi/>
-              <w:jc w:val="right"/>
+              <w:jc w:val="left"/>
             </w:pPr>
             <w:r/>
             <w:r>
               <w:rPr>
-                <w:rFonts w:ascii="David" w:hAnsi="David"/>
+                <w:rFonts w:ascii="Calibri" w:hAnsi="Calibri"/>
                 <w:b/>
                 <w:sz w:val="20"/>
-                <w:rtl/>
               </w:rPr>
               <w:t>avg_binge_fit</w:t>
             </w:r>
@@ -2781,15 +2741,14 @@
           </w:tcPr>
           <w:p>
             <w:pPr>
-              <w:bidi/>
-              <w:jc w:val="right"/>
+              <w:jc w:val="left"/>
             </w:pPr>
             <w:r/>
             <w:r>
               <w:rPr>
-                <w:rFonts w:ascii="David" w:hAnsi="David"/>
+                <w:rFonts w:ascii="Calibri" w:hAnsi="Calibri"/>
+                <w:b w:val="0"/>
                 <w:sz w:val="20"/>
-                <w:rtl/>
               </w:rPr>
               <w:t>1980s</w:t>
             </w:r>
@@ -2801,15 +2760,14 @@
           </w:tcPr>
           <w:p>
             <w:pPr>
-              <w:bidi/>
-              <w:jc w:val="right"/>
+              <w:jc w:val="left"/>
             </w:pPr>
             <w:r/>
             <w:r>
               <w:rPr>
-                <w:rFonts w:ascii="David" w:hAnsi="David"/>
+                <w:rFonts w:ascii="Calibri" w:hAnsi="Calibri"/>
+                <w:b w:val="0"/>
                 <w:sz w:val="20"/>
-                <w:rtl/>
               </w:rPr>
               <w:t>462</w:t>
             </w:r>
@@ -2821,15 +2779,14 @@
           </w:tcPr>
           <w:p>
             <w:pPr>
-              <w:bidi/>
-              <w:jc w:val="right"/>
+              <w:jc w:val="left"/>
             </w:pPr>
             <w:r/>
             <w:r>
               <w:rPr>
-                <w:rFonts w:ascii="David" w:hAnsi="David"/>
+                <w:rFonts w:ascii="Calibri" w:hAnsi="Calibri"/>
+                <w:b w:val="0"/>
                 <w:sz w:val="20"/>
-                <w:rtl/>
               </w:rPr>
               <w:t>7.27</w:t>
             </w:r>
@@ -2841,15 +2798,14 @@
           </w:tcPr>
           <w:p>
             <w:pPr>
-              <w:bidi/>
-              <w:jc w:val="right"/>
+              <w:jc w:val="left"/>
             </w:pPr>
             <w:r/>
             <w:r>
               <w:rPr>
-                <w:rFonts w:ascii="David" w:hAnsi="David"/>
+                <w:rFonts w:ascii="Calibri" w:hAnsi="Calibri"/>
+                <w:b w:val="0"/>
                 <w:sz w:val="20"/>
-                <w:rtl/>
               </w:rPr>
               <w:t>7.3</w:t>
             </w:r>
@@ -2861,15 +2817,14 @@
           </w:tcPr>
           <w:p>
             <w:pPr>
-              <w:bidi/>
-              <w:jc w:val="right"/>
+              <w:jc w:val="left"/>
             </w:pPr>
             <w:r/>
             <w:r>
               <w:rPr>
-                <w:rFonts w:ascii="David" w:hAnsi="David"/>
+                <w:rFonts w:ascii="Calibri" w:hAnsi="Calibri"/>
+                <w:b w:val="0"/>
                 <w:sz w:val="20"/>
-                <w:rtl/>
               </w:rPr>
               <w:t>3.28</w:t>
             </w:r>
@@ -2883,15 +2838,14 @@
           </w:tcPr>
           <w:p>
             <w:pPr>
-              <w:bidi/>
-              <w:jc w:val="right"/>
+              <w:jc w:val="left"/>
             </w:pPr>
             <w:r/>
             <w:r>
               <w:rPr>
-                <w:rFonts w:ascii="David" w:hAnsi="David"/>
+                <w:rFonts w:ascii="Calibri" w:hAnsi="Calibri"/>
+                <w:b w:val="0"/>
                 <w:sz w:val="20"/>
-                <w:rtl/>
               </w:rPr>
               <w:t>1990s</w:t>
             </w:r>
@@ -2903,15 +2857,14 @@
           </w:tcPr>
           <w:p>
             <w:pPr>
-              <w:bidi/>
-              <w:jc w:val="right"/>
+              <w:jc w:val="left"/>
             </w:pPr>
             <w:r/>
             <w:r>
               <w:rPr>
-                <w:rFonts w:ascii="David" w:hAnsi="David"/>
+                <w:rFonts w:ascii="Calibri" w:hAnsi="Calibri"/>
+                <w:b w:val="0"/>
                 <w:sz w:val="20"/>
-                <w:rtl/>
               </w:rPr>
               <w:t>782</w:t>
             </w:r>
@@ -2923,15 +2876,14 @@
           </w:tcPr>
           <w:p>
             <w:pPr>
-              <w:bidi/>
-              <w:jc w:val="right"/>
+              <w:jc w:val="left"/>
             </w:pPr>
             <w:r/>
             <w:r>
               <w:rPr>
-                <w:rFonts w:ascii="David" w:hAnsi="David"/>
+                <w:rFonts w:ascii="Calibri" w:hAnsi="Calibri"/>
+                <w:b w:val="0"/>
                 <w:sz w:val="20"/>
-                <w:rtl/>
               </w:rPr>
               <w:t>7.18</w:t>
             </w:r>
@@ -2943,15 +2895,14 @@
           </w:tcPr>
           <w:p>
             <w:pPr>
-              <w:bidi/>
-              <w:jc w:val="right"/>
+              <w:jc w:val="left"/>
             </w:pPr>
             <w:r/>
             <w:r>
               <w:rPr>
-                <w:rFonts w:ascii="David" w:hAnsi="David"/>
+                <w:rFonts w:ascii="Calibri" w:hAnsi="Calibri"/>
+                <w:b w:val="0"/>
                 <w:sz w:val="20"/>
-                <w:rtl/>
               </w:rPr>
               <w:t>7.25</w:t>
             </w:r>
@@ -2963,15 +2914,14 @@
           </w:tcPr>
           <w:p>
             <w:pPr>
-              <w:bidi/>
-              <w:jc w:val="right"/>
+              <w:jc w:val="left"/>
             </w:pPr>
             <w:r/>
             <w:r>
               <w:rPr>
-                <w:rFonts w:ascii="David" w:hAnsi="David"/>
+                <w:rFonts w:ascii="Calibri" w:hAnsi="Calibri"/>
+                <w:b w:val="0"/>
                 <w:sz w:val="20"/>
-                <w:rtl/>
               </w:rPr>
               <w:t>3.38</w:t>
             </w:r>
@@ -2985,15 +2935,14 @@
           </w:tcPr>
           <w:p>
             <w:pPr>
-              <w:bidi/>
-              <w:jc w:val="right"/>
+              <w:jc w:val="left"/>
             </w:pPr>
             <w:r/>
             <w:r>
               <w:rPr>
-                <w:rFonts w:ascii="David" w:hAnsi="David"/>
+                <w:rFonts w:ascii="Calibri" w:hAnsi="Calibri"/>
+                <w:b w:val="0"/>
                 <w:sz w:val="20"/>
-                <w:rtl/>
               </w:rPr>
               <w:t>2000s</w:t>
             </w:r>
@@ -3005,15 +2954,14 @@
           </w:tcPr>
           <w:p>
             <w:pPr>
-              <w:bidi/>
-              <w:jc w:val="right"/>
+              <w:jc w:val="left"/>
             </w:pPr>
             <w:r/>
             <w:r>
               <w:rPr>
-                <w:rFonts w:ascii="David" w:hAnsi="David"/>
+                <w:rFonts w:ascii="Calibri" w:hAnsi="Calibri"/>
+                <w:b w:val="0"/>
                 <w:sz w:val="20"/>
-                <w:rtl/>
               </w:rPr>
               <w:t>1692</w:t>
             </w:r>
@@ -3025,15 +2973,14 @@
           </w:tcPr>
           <w:p>
             <w:pPr>
-              <w:bidi/>
-              <w:jc w:val="right"/>
+              <w:jc w:val="left"/>
             </w:pPr>
             <w:r/>
             <w:r>
               <w:rPr>
-                <w:rFonts w:ascii="David" w:hAnsi="David"/>
+                <w:rFonts w:ascii="Calibri" w:hAnsi="Calibri"/>
+                <w:b w:val="0"/>
                 <w:sz w:val="20"/>
-                <w:rtl/>
               </w:rPr>
               <w:t>7.26</w:t>
             </w:r>
@@ -3045,15 +2992,14 @@
           </w:tcPr>
           <w:p>
             <w:pPr>
-              <w:bidi/>
-              <w:jc w:val="right"/>
+              <w:jc w:val="left"/>
             </w:pPr>
             <w:r/>
             <w:r>
               <w:rPr>
-                <w:rFonts w:ascii="David" w:hAnsi="David"/>
+                <w:rFonts w:ascii="Calibri" w:hAnsi="Calibri"/>
+                <w:b w:val="0"/>
                 <w:sz w:val="20"/>
-                <w:rtl/>
               </w:rPr>
               <w:t>7.4</w:t>
             </w:r>
@@ -3065,15 +3011,14 @@
           </w:tcPr>
           <w:p>
             <w:pPr>
-              <w:bidi/>
-              <w:jc w:val="right"/>
+              <w:jc w:val="left"/>
             </w:pPr>
             <w:r/>
             <w:r>
               <w:rPr>
-                <w:rFonts w:ascii="David" w:hAnsi="David"/>
+                <w:rFonts w:ascii="Calibri" w:hAnsi="Calibri"/>
+                <w:b w:val="0"/>
                 <w:sz w:val="20"/>
-                <w:rtl/>
               </w:rPr>
               <w:t>3.42</w:t>
             </w:r>
@@ -3087,15 +3032,14 @@
           </w:tcPr>
           <w:p>
             <w:pPr>
-              <w:bidi/>
-              <w:jc w:val="right"/>
+              <w:jc w:val="left"/>
             </w:pPr>
             <w:r/>
             <w:r>
               <w:rPr>
-                <w:rFonts w:ascii="David" w:hAnsi="David"/>
+                <w:rFonts w:ascii="Calibri" w:hAnsi="Calibri"/>
+                <w:b w:val="0"/>
                 <w:sz w:val="20"/>
-                <w:rtl/>
               </w:rPr>
               <w:t>2010s</w:t>
             </w:r>
@@ -3107,15 +3051,14 @@
           </w:tcPr>
           <w:p>
             <w:pPr>
-              <w:bidi/>
-              <w:jc w:val="right"/>
+              <w:jc w:val="left"/>
             </w:pPr>
             <w:r/>
             <w:r>
               <w:rPr>
-                <w:rFonts w:ascii="David" w:hAnsi="David"/>
+                <w:rFonts w:ascii="Calibri" w:hAnsi="Calibri"/>
+                <w:b w:val="0"/>
                 <w:sz w:val="20"/>
-                <w:rtl/>
               </w:rPr>
               <w:t>4801</w:t>
             </w:r>
@@ -3127,15 +3070,14 @@
           </w:tcPr>
           <w:p>
             <w:pPr>
-              <w:bidi/>
-              <w:jc w:val="right"/>
+              <w:jc w:val="left"/>
             </w:pPr>
             <w:r/>
             <w:r>
               <w:rPr>
-                <w:rFonts w:ascii="David" w:hAnsi="David"/>
+                <w:rFonts w:ascii="Calibri" w:hAnsi="Calibri"/>
+                <w:b w:val="0"/>
                 <w:sz w:val="20"/>
-                <w:rtl/>
               </w:rPr>
               <w:t>7.24</w:t>
             </w:r>
@@ -3147,15 +3089,14 @@
           </w:tcPr>
           <w:p>
             <w:pPr>
-              <w:bidi/>
-              <w:jc w:val="right"/>
+              <w:jc w:val="left"/>
             </w:pPr>
             <w:r/>
             <w:r>
               <w:rPr>
-                <w:rFonts w:ascii="David" w:hAnsi="David"/>
+                <w:rFonts w:ascii="Calibri" w:hAnsi="Calibri"/>
+                <w:b w:val="0"/>
                 <w:sz w:val="20"/>
-                <w:rtl/>
               </w:rPr>
               <w:t>7.31</w:t>
             </w:r>
@@ -3167,15 +3108,14 @@
           </w:tcPr>
           <w:p>
             <w:pPr>
-              <w:bidi/>
-              <w:jc w:val="right"/>
+              <w:jc w:val="left"/>
             </w:pPr>
             <w:r/>
             <w:r>
               <w:rPr>
-                <w:rFonts w:ascii="David" w:hAnsi="David"/>
+                <w:rFonts w:ascii="Calibri" w:hAnsi="Calibri"/>
+                <w:b w:val="0"/>
                 <w:sz w:val="20"/>
-                <w:rtl/>
               </w:rPr>
               <w:t>4.37</w:t>
             </w:r>
@@ -3189,15 +3129,14 @@
           </w:tcPr>
           <w:p>
             <w:pPr>
-              <w:bidi/>
-              <w:jc w:val="right"/>
+              <w:jc w:val="left"/>
             </w:pPr>
             <w:r/>
             <w:r>
               <w:rPr>
-                <w:rFonts w:ascii="David" w:hAnsi="David"/>
+                <w:rFonts w:ascii="Calibri" w:hAnsi="Calibri"/>
+                <w:b w:val="0"/>
                 <w:sz w:val="20"/>
-                <w:rtl/>
               </w:rPr>
               <w:t>2020s</w:t>
             </w:r>
@@ -3209,15 +3148,14 @@
           </w:tcPr>
           <w:p>
             <w:pPr>
-              <w:bidi/>
-              <w:jc w:val="right"/>
+              <w:jc w:val="left"/>
             </w:pPr>
             <w:r/>
             <w:r>
               <w:rPr>
-                <w:rFonts w:ascii="David" w:hAnsi="David"/>
+                <w:rFonts w:ascii="Calibri" w:hAnsi="Calibri"/>
+                <w:b w:val="0"/>
                 <w:sz w:val="20"/>
-                <w:rtl/>
               </w:rPr>
               <w:t>2779</w:t>
             </w:r>
@@ -3229,15 +3167,14 @@
           </w:tcPr>
           <w:p>
             <w:pPr>
-              <w:bidi/>
-              <w:jc w:val="right"/>
+              <w:jc w:val="left"/>
             </w:pPr>
             <w:r/>
             <w:r>
               <w:rPr>
-                <w:rFonts w:ascii="David" w:hAnsi="David"/>
+                <w:rFonts w:ascii="Calibri" w:hAnsi="Calibri"/>
+                <w:b w:val="0"/>
                 <w:sz w:val="20"/>
-                <w:rtl/>
               </w:rPr>
               <w:t>7.26</w:t>
             </w:r>
@@ -3249,15 +3186,14 @@
           </w:tcPr>
           <w:p>
             <w:pPr>
-              <w:bidi/>
-              <w:jc w:val="right"/>
+              <w:jc w:val="left"/>
             </w:pPr>
             <w:r/>
             <w:r>
               <w:rPr>
-                <w:rFonts w:ascii="David" w:hAnsi="David"/>
+                <w:rFonts w:ascii="Calibri" w:hAnsi="Calibri"/>
+                <w:b w:val="0"/>
                 <w:sz w:val="20"/>
-                <w:rtl/>
               </w:rPr>
               <w:t>7.31</w:t>
             </w:r>
@@ -3269,15 +3205,14 @@
           </w:tcPr>
           <w:p>
             <w:pPr>
-              <w:bidi/>
-              <w:jc w:val="right"/>
+              <w:jc w:val="left"/>
             </w:pPr>
             <w:r/>
             <w:r>
               <w:rPr>
-                <w:rFonts w:ascii="David" w:hAnsi="David"/>
+                <w:rFonts w:ascii="Calibri" w:hAnsi="Calibri"/>
+                <w:b w:val="0"/>
                 <w:sz w:val="20"/>
-                <w:rtl/>
               </w:rPr>
               <w:t>4.52</w:t>
             </w:r>
@@ -3302,6 +3237,7 @@
       </w:r>
     </w:p>
     <w:p>
+      <w:bookmarkStart w:id="5" w:name="sec56"/>
       <w:pPr>
         <w:pStyle w:val="Heading1"/>
         <w:bidi/>
@@ -3315,6 +3251,7 @@
         </w:rPr>
         <w:t>5-6. בחירת מודל, מימוש והשוואה</w:t>
       </w:r>
+      <w:bookmarkEnd w:id="5"/>
     </w:p>
     <w:p>
       <w:pPr>
@@ -3381,7 +3318,6 @@
         <w:tblStyle w:val="LightGrid-Accent1"/>
         <w:tblW w:type="auto" w:w="0"/>
         <w:tblLook w:firstColumn="1" w:firstRow="1" w:lastColumn="0" w:lastRow="0" w:noHBand="0" w:noVBand="1" w:val="04A0"/>
-        <w:bidiVisual/>
       </w:tblPr>
       <w:tblGrid>
         <w:gridCol w:w="1440"/>
@@ -3398,16 +3334,14 @@
           </w:tcPr>
           <w:p>
             <w:pPr>
-              <w:bidi/>
-              <w:jc w:val="right"/>
+              <w:jc w:val="left"/>
             </w:pPr>
             <w:r/>
             <w:r>
               <w:rPr>
-                <w:rFonts w:ascii="David" w:hAnsi="David"/>
+                <w:rFonts w:ascii="Calibri" w:hAnsi="Calibri"/>
                 <w:b/>
                 <w:sz w:val="20"/>
-                <w:rtl/>
               </w:rPr>
               <w:t>cluster_id</w:t>
             </w:r>
@@ -3419,16 +3353,14 @@
           </w:tcPr>
           <w:p>
             <w:pPr>
-              <w:bidi/>
-              <w:jc w:val="right"/>
+              <w:jc w:val="left"/>
             </w:pPr>
             <w:r/>
             <w:r>
               <w:rPr>
-                <w:rFonts w:ascii="David" w:hAnsi="David"/>
+                <w:rFonts w:ascii="Calibri" w:hAnsi="Calibri"/>
                 <w:b/>
                 <w:sz w:val="20"/>
-                <w:rtl/>
               </w:rPr>
               <w:t>size</w:t>
             </w:r>
@@ -3440,16 +3372,14 @@
           </w:tcPr>
           <w:p>
             <w:pPr>
-              <w:bidi/>
-              <w:jc w:val="right"/>
+              <w:jc w:val="left"/>
             </w:pPr>
             <w:r/>
             <w:r>
               <w:rPr>
-                <w:rFonts w:ascii="David" w:hAnsi="David"/>
+                <w:rFonts w:ascii="Calibri" w:hAnsi="Calibri"/>
                 <w:b/>
                 <w:sz w:val="20"/>
-                <w:rtl/>
               </w:rPr>
               <w:t>top_genres</w:t>
             </w:r>
@@ -3461,16 +3391,14 @@
           </w:tcPr>
           <w:p>
             <w:pPr>
-              <w:bidi/>
-              <w:jc w:val="right"/>
+              <w:jc w:val="left"/>
             </w:pPr>
             <w:r/>
             <w:r>
               <w:rPr>
-                <w:rFonts w:ascii="David" w:hAnsi="David"/>
+                <w:rFonts w:ascii="Calibri" w:hAnsi="Calibri"/>
                 <w:b/>
                 <w:sz w:val="20"/>
-                <w:rtl/>
               </w:rPr>
               <w:t>avg_rating</w:t>
             </w:r>
@@ -3482,16 +3410,14 @@
           </w:tcPr>
           <w:p>
             <w:pPr>
-              <w:bidi/>
-              <w:jc w:val="right"/>
+              <w:jc w:val="left"/>
             </w:pPr>
             <w:r/>
             <w:r>
               <w:rPr>
-                <w:rFonts w:ascii="David" w:hAnsi="David"/>
+                <w:rFonts w:ascii="Calibri" w:hAnsi="Calibri"/>
                 <w:b/>
                 <w:sz w:val="20"/>
-                <w:rtl/>
               </w:rPr>
               <w:t>avg_start_year</w:t>
             </w:r>
@@ -3503,16 +3429,14 @@
           </w:tcPr>
           <w:p>
             <w:pPr>
-              <w:bidi/>
-              <w:jc w:val="right"/>
+              <w:jc w:val="left"/>
             </w:pPr>
             <w:r/>
             <w:r>
               <w:rPr>
-                <w:rFonts w:ascii="David" w:hAnsi="David"/>
+                <w:rFonts w:ascii="Calibri" w:hAnsi="Calibri"/>
                 <w:b/>
                 <w:sz w:val="20"/>
-                <w:rtl/>
               </w:rPr>
               <w:t>avg_binge_fit</w:t>
             </w:r>
@@ -3526,15 +3450,14 @@
           </w:tcPr>
           <w:p>
             <w:pPr>
-              <w:bidi/>
-              <w:jc w:val="right"/>
+              <w:jc w:val="left"/>
             </w:pPr>
             <w:r/>
             <w:r>
               <w:rPr>
-                <w:rFonts w:ascii="David" w:hAnsi="David"/>
+                <w:rFonts w:ascii="Calibri" w:hAnsi="Calibri"/>
+                <w:b w:val="0"/>
                 <w:sz w:val="20"/>
-                <w:rtl/>
               </w:rPr>
               <w:t>0</w:t>
             </w:r>
@@ -3546,15 +3469,14 @@
           </w:tcPr>
           <w:p>
             <w:pPr>
-              <w:bidi/>
-              <w:jc w:val="right"/>
+              <w:jc w:val="left"/>
             </w:pPr>
             <w:r/>
             <w:r>
               <w:rPr>
-                <w:rFonts w:ascii="David" w:hAnsi="David"/>
+                <w:rFonts w:ascii="Calibri" w:hAnsi="Calibri"/>
+                <w:b w:val="0"/>
                 <w:sz w:val="20"/>
-                <w:rtl/>
               </w:rPr>
               <w:t>1328</w:t>
             </w:r>
@@ -3566,15 +3488,14 @@
           </w:tcPr>
           <w:p>
             <w:pPr>
-              <w:bidi/>
-              <w:jc w:val="right"/>
+              <w:jc w:val="left"/>
             </w:pPr>
             <w:r/>
             <w:r>
               <w:rPr>
-                <w:rFonts w:ascii="David" w:hAnsi="David"/>
+                <w:rFonts w:ascii="Calibri" w:hAnsi="Calibri"/>
+                <w:b w:val="0"/>
                 <w:sz w:val="20"/>
-                <w:rtl/>
               </w:rPr>
               <w:t>Animation + Comedy</w:t>
             </w:r>
@@ -3586,15 +3507,14 @@
           </w:tcPr>
           <w:p>
             <w:pPr>
-              <w:bidi/>
-              <w:jc w:val="right"/>
+              <w:jc w:val="left"/>
             </w:pPr>
             <w:r/>
             <w:r>
               <w:rPr>
-                <w:rFonts w:ascii="David" w:hAnsi="David"/>
+                <w:rFonts w:ascii="Calibri" w:hAnsi="Calibri"/>
+                <w:b w:val="0"/>
                 <w:sz w:val="20"/>
-                <w:rtl/>
               </w:rPr>
               <w:t>7.53</w:t>
             </w:r>
@@ -3606,15 +3526,14 @@
           </w:tcPr>
           <w:p>
             <w:pPr>
-              <w:bidi/>
-              <w:jc w:val="right"/>
+              <w:jc w:val="left"/>
             </w:pPr>
             <w:r/>
             <w:r>
               <w:rPr>
-                <w:rFonts w:ascii="David" w:hAnsi="David"/>
+                <w:rFonts w:ascii="Calibri" w:hAnsi="Calibri"/>
+                <w:b w:val="0"/>
                 <w:sz w:val="20"/>
-                <w:rtl/>
               </w:rPr>
               <w:t>2013.5</w:t>
             </w:r>
@@ -3626,15 +3545,14 @@
           </w:tcPr>
           <w:p>
             <w:pPr>
-              <w:bidi/>
-              <w:jc w:val="right"/>
+              <w:jc w:val="left"/>
             </w:pPr>
             <w:r/>
             <w:r>
               <w:rPr>
-                <w:rFonts w:ascii="David" w:hAnsi="David"/>
+                <w:rFonts w:ascii="Calibri" w:hAnsi="Calibri"/>
+                <w:b w:val="0"/>
                 <w:sz w:val="20"/>
-                <w:rtl/>
               </w:rPr>
               <w:t>3.78</w:t>
             </w:r>
@@ -3648,15 +3566,14 @@
           </w:tcPr>
           <w:p>
             <w:pPr>
-              <w:bidi/>
-              <w:jc w:val="right"/>
+              <w:jc w:val="left"/>
             </w:pPr>
             <w:r/>
             <w:r>
               <w:rPr>
-                <w:rFonts w:ascii="David" w:hAnsi="David"/>
+                <w:rFonts w:ascii="Calibri" w:hAnsi="Calibri"/>
+                <w:b w:val="0"/>
                 <w:sz w:val="20"/>
-                <w:rtl/>
               </w:rPr>
               <w:t>1</w:t>
             </w:r>
@@ -3668,15 +3585,14 @@
           </w:tcPr>
           <w:p>
             <w:pPr>
-              <w:bidi/>
-              <w:jc w:val="right"/>
+              <w:jc w:val="left"/>
             </w:pPr>
             <w:r/>
             <w:r>
               <w:rPr>
-                <w:rFonts w:ascii="David" w:hAnsi="David"/>
+                <w:rFonts w:ascii="Calibri" w:hAnsi="Calibri"/>
+                <w:b w:val="0"/>
                 <w:sz w:val="20"/>
-                <w:rtl/>
               </w:rPr>
               <w:t>2960</w:t>
             </w:r>
@@ -3688,15 +3604,14 @@
           </w:tcPr>
           <w:p>
             <w:pPr>
-              <w:bidi/>
-              <w:jc w:val="right"/>
+              <w:jc w:val="left"/>
             </w:pPr>
             <w:r/>
             <w:r>
               <w:rPr>
-                <w:rFonts w:ascii="David" w:hAnsi="David"/>
+                <w:rFonts w:ascii="Calibri" w:hAnsi="Calibri"/>
+                <w:b w:val="0"/>
                 <w:sz w:val="20"/>
-                <w:rtl/>
               </w:rPr>
               <w:t>Drama + Comedy</w:t>
             </w:r>
@@ -3708,15 +3623,14 @@
           </w:tcPr>
           <w:p>
             <w:pPr>
-              <w:bidi/>
-              <w:jc w:val="right"/>
+              <w:jc w:val="left"/>
             </w:pPr>
             <w:r/>
             <w:r>
               <w:rPr>
-                <w:rFonts w:ascii="David" w:hAnsi="David"/>
+                <w:rFonts w:ascii="Calibri" w:hAnsi="Calibri"/>
+                <w:b w:val="0"/>
                 <w:sz w:val="20"/>
-                <w:rtl/>
               </w:rPr>
               <w:t>7.07</w:t>
             </w:r>
@@ -3728,15 +3642,14 @@
           </w:tcPr>
           <w:p>
             <w:pPr>
-              <w:bidi/>
-              <w:jc w:val="right"/>
+              <w:jc w:val="left"/>
             </w:pPr>
             <w:r/>
             <w:r>
               <w:rPr>
-                <w:rFonts w:ascii="David" w:hAnsi="David"/>
+                <w:rFonts w:ascii="Calibri" w:hAnsi="Calibri"/>
+                <w:b w:val="0"/>
                 <w:sz w:val="20"/>
-                <w:rtl/>
               </w:rPr>
               <w:t>2016.4</w:t>
             </w:r>
@@ -3748,15 +3661,14 @@
           </w:tcPr>
           <w:p>
             <w:pPr>
-              <w:bidi/>
-              <w:jc w:val="right"/>
+              <w:jc w:val="left"/>
             </w:pPr>
             <w:r/>
             <w:r>
               <w:rPr>
-                <w:rFonts w:ascii="David" w:hAnsi="David"/>
+                <w:rFonts w:ascii="Calibri" w:hAnsi="Calibri"/>
+                <w:b w:val="0"/>
                 <w:sz w:val="20"/>
-                <w:rtl/>
               </w:rPr>
               <w:t>3.72</w:t>
             </w:r>
@@ -3770,15 +3682,14 @@
           </w:tcPr>
           <w:p>
             <w:pPr>
-              <w:bidi/>
-              <w:jc w:val="right"/>
+              <w:jc w:val="left"/>
             </w:pPr>
             <w:r/>
             <w:r>
               <w:rPr>
-                <w:rFonts w:ascii="David" w:hAnsi="David"/>
+                <w:rFonts w:ascii="Calibri" w:hAnsi="Calibri"/>
+                <w:b w:val="0"/>
                 <w:sz w:val="20"/>
-                <w:rtl/>
               </w:rPr>
               <w:t>2</w:t>
             </w:r>
@@ -3790,15 +3701,14 @@
           </w:tcPr>
           <w:p>
             <w:pPr>
-              <w:bidi/>
-              <w:jc w:val="right"/>
+              <w:jc w:val="left"/>
             </w:pPr>
             <w:r/>
             <w:r>
               <w:rPr>
-                <w:rFonts w:ascii="David" w:hAnsi="David"/>
+                <w:rFonts w:ascii="Calibri" w:hAnsi="Calibri"/>
+                <w:b w:val="0"/>
                 <w:sz w:val="20"/>
-                <w:rtl/>
               </w:rPr>
               <w:t>320</w:t>
             </w:r>
@@ -3810,15 +3720,14 @@
           </w:tcPr>
           <w:p>
             <w:pPr>
-              <w:bidi/>
-              <w:jc w:val="right"/>
+              <w:jc w:val="left"/>
             </w:pPr>
             <w:r/>
             <w:r>
               <w:rPr>
-                <w:rFonts w:ascii="David" w:hAnsi="David"/>
+                <w:rFonts w:ascii="Calibri" w:hAnsi="Calibri"/>
+                <w:b w:val="0"/>
                 <w:sz w:val="20"/>
-                <w:rtl/>
               </w:rPr>
               <w:t>Comedy + Documentary</w:t>
             </w:r>
@@ -3830,15 +3739,14 @@
           </w:tcPr>
           <w:p>
             <w:pPr>
-              <w:bidi/>
-              <w:jc w:val="right"/>
+              <w:jc w:val="left"/>
             </w:pPr>
             <w:r/>
             <w:r>
               <w:rPr>
-                <w:rFonts w:ascii="David" w:hAnsi="David"/>
+                <w:rFonts w:ascii="Calibri" w:hAnsi="Calibri"/>
+                <w:b w:val="0"/>
                 <w:sz w:val="20"/>
-                <w:rtl/>
               </w:rPr>
               <w:t>6.75</w:t>
             </w:r>
@@ -3850,15 +3758,14 @@
           </w:tcPr>
           <w:p>
             <w:pPr>
-              <w:bidi/>
-              <w:jc w:val="right"/>
+              <w:jc w:val="left"/>
             </w:pPr>
             <w:r/>
             <w:r>
               <w:rPr>
-                <w:rFonts w:ascii="David" w:hAnsi="David"/>
+                <w:rFonts w:ascii="Calibri" w:hAnsi="Calibri"/>
+                <w:b w:val="0"/>
                 <w:sz w:val="20"/>
-                <w:rtl/>
               </w:rPr>
               <w:t>2003.2</w:t>
             </w:r>
@@ -3870,15 +3777,14 @@
           </w:tcPr>
           <w:p>
             <w:pPr>
-              <w:bidi/>
-              <w:jc w:val="right"/>
+              <w:jc w:val="left"/>
             </w:pPr>
             <w:r/>
             <w:r>
               <w:rPr>
-                <w:rFonts w:ascii="David" w:hAnsi="David"/>
+                <w:rFonts w:ascii="Calibri" w:hAnsi="Calibri"/>
+                <w:b w:val="0"/>
                 <w:sz w:val="20"/>
-                <w:rtl/>
               </w:rPr>
               <w:t>3.02</w:t>
             </w:r>
@@ -3892,15 +3798,14 @@
           </w:tcPr>
           <w:p>
             <w:pPr>
-              <w:bidi/>
-              <w:jc w:val="right"/>
+              <w:jc w:val="left"/>
             </w:pPr>
             <w:r/>
             <w:r>
               <w:rPr>
-                <w:rFonts w:ascii="David" w:hAnsi="David"/>
+                <w:rFonts w:ascii="Calibri" w:hAnsi="Calibri"/>
+                <w:b w:val="0"/>
                 <w:sz w:val="20"/>
-                <w:rtl/>
               </w:rPr>
               <w:t>3</w:t>
             </w:r>
@@ -3912,15 +3817,14 @@
           </w:tcPr>
           <w:p>
             <w:pPr>
-              <w:bidi/>
-              <w:jc w:val="right"/>
+              <w:jc w:val="left"/>
             </w:pPr>
             <w:r/>
             <w:r>
               <w:rPr>
-                <w:rFonts w:ascii="David" w:hAnsi="David"/>
+                <w:rFonts w:ascii="Calibri" w:hAnsi="Calibri"/>
+                <w:b w:val="0"/>
                 <w:sz w:val="20"/>
-                <w:rtl/>
               </w:rPr>
               <w:t>1195</w:t>
             </w:r>
@@ -3932,15 +3836,14 @@
           </w:tcPr>
           <w:p>
             <w:pPr>
-              <w:bidi/>
-              <w:jc w:val="right"/>
+              <w:jc w:val="left"/>
             </w:pPr>
             <w:r/>
             <w:r>
               <w:rPr>
-                <w:rFonts w:ascii="David" w:hAnsi="David"/>
+                <w:rFonts w:ascii="Calibri" w:hAnsi="Calibri"/>
+                <w:b w:val="0"/>
                 <w:sz w:val="20"/>
-                <w:rtl/>
               </w:rPr>
               <w:t>Comedy + Drama</w:t>
             </w:r>
@@ -3952,15 +3855,14 @@
           </w:tcPr>
           <w:p>
             <w:pPr>
-              <w:bidi/>
-              <w:jc w:val="right"/>
+              <w:jc w:val="left"/>
             </w:pPr>
             <w:r/>
             <w:r>
               <w:rPr>
-                <w:rFonts w:ascii="David" w:hAnsi="David"/>
+                <w:rFonts w:ascii="Calibri" w:hAnsi="Calibri"/>
+                <w:b w:val="0"/>
                 <w:sz w:val="20"/>
-                <w:rtl/>
               </w:rPr>
               <w:t>7.35</w:t>
             </w:r>
@@ -3972,15 +3874,14 @@
           </w:tcPr>
           <w:p>
             <w:pPr>
-              <w:bidi/>
-              <w:jc w:val="right"/>
+              <w:jc w:val="left"/>
             </w:pPr>
             <w:r/>
             <w:r>
               <w:rPr>
-                <w:rFonts w:ascii="David" w:hAnsi="David"/>
+                <w:rFonts w:ascii="Calibri" w:hAnsi="Calibri"/>
+                <w:b w:val="0"/>
                 <w:sz w:val="20"/>
-                <w:rtl/>
               </w:rPr>
               <w:t>1982.7</w:t>
             </w:r>
@@ -3992,15 +3893,14 @@
           </w:tcPr>
           <w:p>
             <w:pPr>
-              <w:bidi/>
-              <w:jc w:val="right"/>
+              <w:jc w:val="left"/>
             </w:pPr>
             <w:r/>
             <w:r>
               <w:rPr>
-                <w:rFonts w:ascii="David" w:hAnsi="David"/>
+                <w:rFonts w:ascii="Calibri" w:hAnsi="Calibri"/>
+                <w:b w:val="0"/>
                 <w:sz w:val="20"/>
-                <w:rtl/>
               </w:rPr>
               <w:t>3.25</w:t>
             </w:r>
@@ -4014,15 +3914,14 @@
           </w:tcPr>
           <w:p>
             <w:pPr>
-              <w:bidi/>
-              <w:jc w:val="right"/>
+              <w:jc w:val="left"/>
             </w:pPr>
             <w:r/>
             <w:r>
               <w:rPr>
-                <w:rFonts w:ascii="David" w:hAnsi="David"/>
+                <w:rFonts w:ascii="Calibri" w:hAnsi="Calibri"/>
+                <w:b w:val="0"/>
                 <w:sz w:val="20"/>
-                <w:rtl/>
               </w:rPr>
               <w:t>4</w:t>
             </w:r>
@@ -4034,15 +3933,14 @@
           </w:tcPr>
           <w:p>
             <w:pPr>
-              <w:bidi/>
-              <w:jc w:val="right"/>
+              <w:jc w:val="left"/>
             </w:pPr>
             <w:r/>
             <w:r>
               <w:rPr>
-                <w:rFonts w:ascii="David" w:hAnsi="David"/>
+                <w:rFonts w:ascii="Calibri" w:hAnsi="Calibri"/>
+                <w:b w:val="0"/>
                 <w:sz w:val="20"/>
-                <w:rtl/>
               </w:rPr>
               <w:t>1435</w:t>
             </w:r>
@@ -4054,15 +3952,14 @@
           </w:tcPr>
           <w:p>
             <w:pPr>
-              <w:bidi/>
-              <w:jc w:val="right"/>
+              <w:jc w:val="left"/>
             </w:pPr>
             <w:r/>
             <w:r>
               <w:rPr>
-                <w:rFonts w:ascii="David" w:hAnsi="David"/>
+                <w:rFonts w:ascii="Calibri" w:hAnsi="Calibri"/>
+                <w:b w:val="0"/>
                 <w:sz w:val="20"/>
-                <w:rtl/>
               </w:rPr>
               <w:t>Drama + Comedy</w:t>
             </w:r>
@@ -4074,15 +3971,14 @@
           </w:tcPr>
           <w:p>
             <w:pPr>
-              <w:bidi/>
-              <w:jc w:val="right"/>
+              <w:jc w:val="left"/>
             </w:pPr>
             <w:r/>
             <w:r>
               <w:rPr>
-                <w:rFonts w:ascii="David" w:hAnsi="David"/>
+                <w:rFonts w:ascii="Calibri" w:hAnsi="Calibri"/>
+                <w:b w:val="0"/>
                 <w:sz w:val="20"/>
-                <w:rtl/>
               </w:rPr>
               <w:t>7.09</w:t>
             </w:r>
@@ -4094,15 +3990,14 @@
           </w:tcPr>
           <w:p>
             <w:pPr>
-              <w:bidi/>
-              <w:jc w:val="right"/>
+              <w:jc w:val="left"/>
             </w:pPr>
             <w:r/>
             <w:r>
               <w:rPr>
-                <w:rFonts w:ascii="David" w:hAnsi="David"/>
+                <w:rFonts w:ascii="Calibri" w:hAnsi="Calibri"/>
+                <w:b w:val="0"/>
                 <w:sz w:val="20"/>
-                <w:rtl/>
               </w:rPr>
               <w:t>2014.8</w:t>
             </w:r>
@@ -4114,15 +4009,14 @@
           </w:tcPr>
           <w:p>
             <w:pPr>
-              <w:bidi/>
-              <w:jc w:val="right"/>
+              <w:jc w:val="left"/>
             </w:pPr>
             <w:r/>
             <w:r>
               <w:rPr>
-                <w:rFonts w:ascii="David" w:hAnsi="David"/>
+                <w:rFonts w:ascii="Calibri" w:hAnsi="Calibri"/>
+                <w:b w:val="0"/>
                 <w:sz w:val="20"/>
-                <w:rtl/>
               </w:rPr>
               <w:t>5.66</w:t>
             </w:r>
@@ -4136,15 +4030,14 @@
           </w:tcPr>
           <w:p>
             <w:pPr>
-              <w:bidi/>
-              <w:jc w:val="right"/>
+              <w:jc w:val="left"/>
             </w:pPr>
             <w:r/>
             <w:r>
               <w:rPr>
-                <w:rFonts w:ascii="David" w:hAnsi="David"/>
+                <w:rFonts w:ascii="Calibri" w:hAnsi="Calibri"/>
+                <w:b w:val="0"/>
                 <w:sz w:val="20"/>
-                <w:rtl/>
               </w:rPr>
               <w:t>5</w:t>
             </w:r>
@@ -4156,15 +4049,14 @@
           </w:tcPr>
           <w:p>
             <w:pPr>
-              <w:bidi/>
-              <w:jc w:val="right"/>
+              <w:jc w:val="left"/>
             </w:pPr>
             <w:r/>
             <w:r>
               <w:rPr>
-                <w:rFonts w:ascii="David" w:hAnsi="David"/>
+                <w:rFonts w:ascii="Calibri" w:hAnsi="Calibri"/>
+                <w:b w:val="0"/>
                 <w:sz w:val="20"/>
-                <w:rtl/>
               </w:rPr>
               <w:t>71</w:t>
             </w:r>
@@ -4176,15 +4068,14 @@
           </w:tcPr>
           <w:p>
             <w:pPr>
-              <w:bidi/>
-              <w:jc w:val="right"/>
+              <w:jc w:val="left"/>
             </w:pPr>
             <w:r/>
             <w:r>
               <w:rPr>
-                <w:rFonts w:ascii="David" w:hAnsi="David"/>
+                <w:rFonts w:ascii="Calibri" w:hAnsi="Calibri"/>
+                <w:b w:val="0"/>
                 <w:sz w:val="20"/>
-                <w:rtl/>
               </w:rPr>
               <w:t>Documentary + Drama</w:t>
             </w:r>
@@ -4196,15 +4087,14 @@
           </w:tcPr>
           <w:p>
             <w:pPr>
-              <w:bidi/>
-              <w:jc w:val="right"/>
+              <w:jc w:val="left"/>
             </w:pPr>
             <w:r/>
             <w:r>
               <w:rPr>
-                <w:rFonts w:ascii="David" w:hAnsi="David"/>
+                <w:rFonts w:ascii="Calibri" w:hAnsi="Calibri"/>
+                <w:b w:val="0"/>
                 <w:sz w:val="20"/>
-                <w:rtl/>
               </w:rPr>
               <w:t>6.51</w:t>
             </w:r>
@@ -4216,15 +4106,14 @@
           </w:tcPr>
           <w:p>
             <w:pPr>
-              <w:bidi/>
-              <w:jc w:val="right"/>
+              <w:jc w:val="left"/>
             </w:pPr>
             <w:r/>
             <w:r>
               <w:rPr>
-                <w:rFonts w:ascii="David" w:hAnsi="David"/>
+                <w:rFonts w:ascii="Calibri" w:hAnsi="Calibri"/>
+                <w:b w:val="0"/>
                 <w:sz w:val="20"/>
-                <w:rtl/>
               </w:rPr>
               <w:t>1982.8</w:t>
             </w:r>
@@ -4236,15 +4125,14 @@
           </w:tcPr>
           <w:p>
             <w:pPr>
-              <w:bidi/>
-              <w:jc w:val="right"/>
+              <w:jc w:val="left"/>
             </w:pPr>
             <w:r/>
             <w:r>
               <w:rPr>
-                <w:rFonts w:ascii="David" w:hAnsi="David"/>
+                <w:rFonts w:ascii="Calibri" w:hAnsi="Calibri"/>
+                <w:b w:val="0"/>
                 <w:sz w:val="20"/>
-                <w:rtl/>
               </w:rPr>
               <w:t>2.63</w:t>
             </w:r>
@@ -4258,15 +4146,14 @@
           </w:tcPr>
           <w:p>
             <w:pPr>
-              <w:bidi/>
-              <w:jc w:val="right"/>
+              <w:jc w:val="left"/>
             </w:pPr>
             <w:r/>
             <w:r>
               <w:rPr>
-                <w:rFonts w:ascii="David" w:hAnsi="David"/>
+                <w:rFonts w:ascii="Calibri" w:hAnsi="Calibri"/>
+                <w:b w:val="0"/>
                 <w:sz w:val="20"/>
-                <w:rtl/>
               </w:rPr>
               <w:t>6</w:t>
             </w:r>
@@ -4278,15 +4165,14 @@
           </w:tcPr>
           <w:p>
             <w:pPr>
-              <w:bidi/>
-              <w:jc w:val="right"/>
+              <w:jc w:val="left"/>
             </w:pPr>
             <w:r/>
             <w:r>
               <w:rPr>
-                <w:rFonts w:ascii="David" w:hAnsi="David"/>
+                <w:rFonts w:ascii="Calibri" w:hAnsi="Calibri"/>
+                <w:b w:val="0"/>
                 <w:sz w:val="20"/>
-                <w:rtl/>
               </w:rPr>
               <w:t>2414</w:t>
             </w:r>
@@ -4298,15 +4184,14 @@
           </w:tcPr>
           <w:p>
             <w:pPr>
-              <w:bidi/>
-              <w:jc w:val="right"/>
+              <w:jc w:val="left"/>
             </w:pPr>
             <w:r/>
             <w:r>
               <w:rPr>
-                <w:rFonts w:ascii="David" w:hAnsi="David"/>
+                <w:rFonts w:ascii="Calibri" w:hAnsi="Calibri"/>
+                <w:b w:val="0"/>
                 <w:sz w:val="20"/>
-                <w:rtl/>
               </w:rPr>
               <w:t>Drama + Comedy</w:t>
             </w:r>
@@ -4318,15 +4203,14 @@
           </w:tcPr>
           <w:p>
             <w:pPr>
-              <w:bidi/>
-              <w:jc w:val="right"/>
+              <w:jc w:val="left"/>
             </w:pPr>
             <w:r/>
             <w:r>
               <w:rPr>
-                <w:rFonts w:ascii="David" w:hAnsi="David"/>
+                <w:rFonts w:ascii="Calibri" w:hAnsi="Calibri"/>
+                <w:b w:val="0"/>
                 <w:sz w:val="20"/>
-                <w:rtl/>
               </w:rPr>
               <w:t>8.26</w:t>
             </w:r>
@@ -4338,15 +4222,14 @@
           </w:tcPr>
           <w:p>
             <w:pPr>
-              <w:bidi/>
-              <w:jc w:val="right"/>
+              <w:jc w:val="left"/>
             </w:pPr>
             <w:r/>
             <w:r>
               <w:rPr>
-                <w:rFonts w:ascii="David" w:hAnsi="David"/>
+                <w:rFonts w:ascii="Calibri" w:hAnsi="Calibri"/>
+                <w:b w:val="0"/>
                 <w:sz w:val="20"/>
-                <w:rtl/>
               </w:rPr>
               <w:t>2014.3</w:t>
             </w:r>
@@ -4358,15 +4241,14 @@
           </w:tcPr>
           <w:p>
             <w:pPr>
-              <w:bidi/>
-              <w:jc w:val="right"/>
+              <w:jc w:val="left"/>
             </w:pPr>
             <w:r/>
             <w:r>
               <w:rPr>
-                <w:rFonts w:ascii="David" w:hAnsi="David"/>
+                <w:rFonts w:ascii="Calibri" w:hAnsi="Calibri"/>
+                <w:b w:val="0"/>
                 <w:sz w:val="20"/>
-                <w:rtl/>
               </w:rPr>
               <w:t>4.98</w:t>
             </w:r>
@@ -4380,15 +4262,14 @@
           </w:tcPr>
           <w:p>
             <w:pPr>
-              <w:bidi/>
-              <w:jc w:val="right"/>
+              <w:jc w:val="left"/>
             </w:pPr>
             <w:r/>
             <w:r>
               <w:rPr>
-                <w:rFonts w:ascii="David" w:hAnsi="David"/>
+                <w:rFonts w:ascii="Calibri" w:hAnsi="Calibri"/>
+                <w:b w:val="0"/>
                 <w:sz w:val="20"/>
-                <w:rtl/>
               </w:rPr>
               <w:t>7</w:t>
             </w:r>
@@ -4400,15 +4281,14 @@
           </w:tcPr>
           <w:p>
             <w:pPr>
-              <w:bidi/>
-              <w:jc w:val="right"/>
+              <w:jc w:val="left"/>
             </w:pPr>
             <w:r/>
             <w:r>
               <w:rPr>
-                <w:rFonts w:ascii="David" w:hAnsi="David"/>
+                <w:rFonts w:ascii="Calibri" w:hAnsi="Calibri"/>
+                <w:b w:val="0"/>
                 <w:sz w:val="20"/>
-                <w:rtl/>
               </w:rPr>
               <w:t>1290</w:t>
             </w:r>
@@ -4420,15 +4300,14 @@
           </w:tcPr>
           <w:p>
             <w:pPr>
-              <w:bidi/>
-              <w:jc w:val="right"/>
+              <w:jc w:val="left"/>
             </w:pPr>
             <w:r/>
             <w:r>
               <w:rPr>
-                <w:rFonts w:ascii="David" w:hAnsi="David"/>
+                <w:rFonts w:ascii="Calibri" w:hAnsi="Calibri"/>
+                <w:b w:val="0"/>
                 <w:sz w:val="20"/>
-                <w:rtl/>
               </w:rPr>
               <w:t>Comedy + Drama</w:t>
             </w:r>
@@ -4440,15 +4319,14 @@
           </w:tcPr>
           <w:p>
             <w:pPr>
-              <w:bidi/>
-              <w:jc w:val="right"/>
+              <w:jc w:val="left"/>
             </w:pPr>
             <w:r/>
             <w:r>
               <w:rPr>
-                <w:rFonts w:ascii="David" w:hAnsi="David"/>
+                <w:rFonts w:ascii="Calibri" w:hAnsi="Calibri"/>
+                <w:b w:val="0"/>
                 <w:sz w:val="20"/>
-                <w:rtl/>
               </w:rPr>
               <w:t>5.68</w:t>
             </w:r>
@@ -4460,15 +4338,14 @@
           </w:tcPr>
           <w:p>
             <w:pPr>
-              <w:bidi/>
-              <w:jc w:val="right"/>
+              <w:jc w:val="left"/>
             </w:pPr>
             <w:r/>
             <w:r>
               <w:rPr>
-                <w:rFonts w:ascii="David" w:hAnsi="David"/>
+                <w:rFonts w:ascii="Calibri" w:hAnsi="Calibri"/>
+                <w:b w:val="0"/>
                 <w:sz w:val="20"/>
-                <w:rtl/>
               </w:rPr>
               <w:t>2012.6</w:t>
             </w:r>
@@ -4480,15 +4357,14 @@
           </w:tcPr>
           <w:p>
             <w:pPr>
-              <w:bidi/>
-              <w:jc w:val="right"/>
+              <w:jc w:val="left"/>
             </w:pPr>
             <w:r/>
             <w:r>
               <w:rPr>
-                <w:rFonts w:ascii="David" w:hAnsi="David"/>
+                <w:rFonts w:ascii="Calibri" w:hAnsi="Calibri"/>
+                <w:b w:val="0"/>
                 <w:sz w:val="20"/>
-                <w:rtl/>
               </w:rPr>
               <w:t>3.01</w:t>
             </w:r>
@@ -4517,7 +4393,6 @@
         <w:tblStyle w:val="LightGrid-Accent1"/>
         <w:tblW w:type="auto" w:w="0"/>
         <w:tblLook w:firstColumn="1" w:firstRow="1" w:lastColumn="0" w:lastRow="0" w:noHBand="0" w:noVBand="1" w:val="04A0"/>
-        <w:bidiVisual/>
       </w:tblPr>
       <w:tblGrid>
         <w:gridCol w:w="2880"/>
@@ -4531,16 +4406,14 @@
           </w:tcPr>
           <w:p>
             <w:pPr>
-              <w:bidi/>
-              <w:jc w:val="right"/>
+              <w:jc w:val="left"/>
             </w:pPr>
             <w:r/>
             <w:r>
               <w:rPr>
-                <w:rFonts w:ascii="David" w:hAnsi="David"/>
+                <w:rFonts w:ascii="Calibri" w:hAnsi="Calibri"/>
                 <w:b/>
                 <w:sz w:val="20"/>
-                <w:rtl/>
               </w:rPr>
               <w:t>k</w:t>
             </w:r>
@@ -4552,16 +4425,14 @@
           </w:tcPr>
           <w:p>
             <w:pPr>
-              <w:bidi/>
-              <w:jc w:val="right"/>
+              <w:jc w:val="left"/>
             </w:pPr>
             <w:r/>
             <w:r>
               <w:rPr>
-                <w:rFonts w:ascii="David" w:hAnsi="David"/>
+                <w:rFonts w:ascii="Calibri" w:hAnsi="Calibri"/>
                 <w:b/>
                 <w:sz w:val="20"/>
-                <w:rtl/>
               </w:rPr>
               <w:t>silhouette</w:t>
             </w:r>
@@ -4573,16 +4444,14 @@
           </w:tcPr>
           <w:p>
             <w:pPr>
-              <w:bidi/>
-              <w:jc w:val="right"/>
+              <w:jc w:val="left"/>
             </w:pPr>
             <w:r/>
             <w:r>
               <w:rPr>
-                <w:rFonts w:ascii="David" w:hAnsi="David"/>
+                <w:rFonts w:ascii="Calibri" w:hAnsi="Calibri"/>
                 <w:b/>
                 <w:sz w:val="20"/>
-                <w:rtl/>
               </w:rPr>
               <w:t>chosen</w:t>
             </w:r>
@@ -4596,15 +4465,14 @@
           </w:tcPr>
           <w:p>
             <w:pPr>
-              <w:bidi/>
-              <w:jc w:val="right"/>
+              <w:jc w:val="left"/>
             </w:pPr>
             <w:r/>
             <w:r>
               <w:rPr>
-                <w:rFonts w:ascii="David" w:hAnsi="David"/>
+                <w:rFonts w:ascii="Calibri" w:hAnsi="Calibri"/>
+                <w:b w:val="0"/>
                 <w:sz w:val="20"/>
-                <w:rtl/>
               </w:rPr>
               <w:t>6</w:t>
             </w:r>
@@ -4616,15 +4484,14 @@
           </w:tcPr>
           <w:p>
             <w:pPr>
-              <w:bidi/>
-              <w:jc w:val="right"/>
+              <w:jc w:val="left"/>
             </w:pPr>
             <w:r/>
             <w:r>
               <w:rPr>
-                <w:rFonts w:ascii="David" w:hAnsi="David"/>
+                <w:rFonts w:ascii="Calibri" w:hAnsi="Calibri"/>
+                <w:b w:val="0"/>
                 <w:sz w:val="20"/>
-                <w:rtl/>
               </w:rPr>
               <w:t>0.1688</w:t>
             </w:r>
@@ -4636,15 +4503,14 @@
           </w:tcPr>
           <w:p>
             <w:pPr>
-              <w:bidi/>
-              <w:jc w:val="right"/>
+              <w:jc w:val="left"/>
             </w:pPr>
             <w:r/>
             <w:r>
               <w:rPr>
-                <w:rFonts w:ascii="David" w:hAnsi="David"/>
+                <w:rFonts w:ascii="Calibri" w:hAnsi="Calibri"/>
+                <w:b w:val="0"/>
                 <w:sz w:val="20"/>
-                <w:rtl/>
               </w:rPr>
               <w:t>False</w:t>
             </w:r>
@@ -4658,15 +4524,14 @@
           </w:tcPr>
           <w:p>
             <w:pPr>
-              <w:bidi/>
-              <w:jc w:val="right"/>
+              <w:jc w:val="left"/>
             </w:pPr>
             <w:r/>
             <w:r>
               <w:rPr>
-                <w:rFonts w:ascii="David" w:hAnsi="David"/>
+                <w:rFonts w:ascii="Calibri" w:hAnsi="Calibri"/>
+                <w:b w:val="0"/>
                 <w:sz w:val="20"/>
-                <w:rtl/>
               </w:rPr>
               <w:t>7</w:t>
             </w:r>
@@ -4678,15 +4543,14 @@
           </w:tcPr>
           <w:p>
             <w:pPr>
-              <w:bidi/>
-              <w:jc w:val="right"/>
+              <w:jc w:val="left"/>
             </w:pPr>
             <w:r/>
             <w:r>
               <w:rPr>
-                <w:rFonts w:ascii="David" w:hAnsi="David"/>
+                <w:rFonts w:ascii="Calibri" w:hAnsi="Calibri"/>
+                <w:b w:val="0"/>
                 <w:sz w:val="20"/>
-                <w:rtl/>
               </w:rPr>
               <w:t>0.173</w:t>
             </w:r>
@@ -4698,15 +4562,14 @@
           </w:tcPr>
           <w:p>
             <w:pPr>
-              <w:bidi/>
-              <w:jc w:val="right"/>
+              <w:jc w:val="left"/>
             </w:pPr>
             <w:r/>
             <w:r>
               <w:rPr>
-                <w:rFonts w:ascii="David" w:hAnsi="David"/>
+                <w:rFonts w:ascii="Calibri" w:hAnsi="Calibri"/>
+                <w:b w:val="0"/>
                 <w:sz w:val="20"/>
-                <w:rtl/>
               </w:rPr>
               <w:t>False</w:t>
             </w:r>
@@ -4720,15 +4583,14 @@
           </w:tcPr>
           <w:p>
             <w:pPr>
-              <w:bidi/>
-              <w:jc w:val="right"/>
+              <w:jc w:val="left"/>
             </w:pPr>
             <w:r/>
             <w:r>
               <w:rPr>
-                <w:rFonts w:ascii="David" w:hAnsi="David"/>
+                <w:rFonts w:ascii="Calibri" w:hAnsi="Calibri"/>
+                <w:b w:val="0"/>
                 <w:sz w:val="20"/>
-                <w:rtl/>
               </w:rPr>
               <w:t>8</w:t>
             </w:r>
@@ -4740,15 +4602,14 @@
           </w:tcPr>
           <w:p>
             <w:pPr>
-              <w:bidi/>
-              <w:jc w:val="right"/>
+              <w:jc w:val="left"/>
             </w:pPr>
             <w:r/>
             <w:r>
               <w:rPr>
-                <w:rFonts w:ascii="David" w:hAnsi="David"/>
+                <w:rFonts w:ascii="Calibri" w:hAnsi="Calibri"/>
+                <w:b w:val="0"/>
                 <w:sz w:val="20"/>
-                <w:rtl/>
               </w:rPr>
               <w:t>0.1775</w:t>
             </w:r>
@@ -4760,15 +4621,14 @@
           </w:tcPr>
           <w:p>
             <w:pPr>
-              <w:bidi/>
-              <w:jc w:val="right"/>
+              <w:jc w:val="left"/>
             </w:pPr>
             <w:r/>
             <w:r>
               <w:rPr>
-                <w:rFonts w:ascii="David" w:hAnsi="David"/>
+                <w:rFonts w:ascii="Calibri" w:hAnsi="Calibri"/>
+                <w:b w:val="0"/>
                 <w:sz w:val="20"/>
-                <w:rtl/>
               </w:rPr>
               <w:t>True</w:t>
             </w:r>
@@ -4782,15 +4642,14 @@
           </w:tcPr>
           <w:p>
             <w:pPr>
-              <w:bidi/>
-              <w:jc w:val="right"/>
+              <w:jc w:val="left"/>
             </w:pPr>
             <w:r/>
             <w:r>
               <w:rPr>
-                <w:rFonts w:ascii="David" w:hAnsi="David"/>
+                <w:rFonts w:ascii="Calibri" w:hAnsi="Calibri"/>
+                <w:b w:val="0"/>
                 <w:sz w:val="20"/>
-                <w:rtl/>
               </w:rPr>
               <w:t>9</w:t>
             </w:r>
@@ -4802,15 +4661,14 @@
           </w:tcPr>
           <w:p>
             <w:pPr>
-              <w:bidi/>
-              <w:jc w:val="right"/>
+              <w:jc w:val="left"/>
             </w:pPr>
             <w:r/>
             <w:r>
               <w:rPr>
-                <w:rFonts w:ascii="David" w:hAnsi="David"/>
+                <w:rFonts w:ascii="Calibri" w:hAnsi="Calibri"/>
+                <w:b w:val="0"/>
                 <w:sz w:val="20"/>
-                <w:rtl/>
               </w:rPr>
               <w:t>0.1654</w:t>
             </w:r>
@@ -4822,15 +4680,14 @@
           </w:tcPr>
           <w:p>
             <w:pPr>
-              <w:bidi/>
-              <w:jc w:val="right"/>
+              <w:jc w:val="left"/>
             </w:pPr>
             <w:r/>
             <w:r>
               <w:rPr>
-                <w:rFonts w:ascii="David" w:hAnsi="David"/>
+                <w:rFonts w:ascii="Calibri" w:hAnsi="Calibri"/>
+                <w:b w:val="0"/>
                 <w:sz w:val="20"/>
-                <w:rtl/>
               </w:rPr>
               <w:t>False</w:t>
             </w:r>
@@ -4844,15 +4701,14 @@
           </w:tcPr>
           <w:p>
             <w:pPr>
-              <w:bidi/>
-              <w:jc w:val="right"/>
+              <w:jc w:val="left"/>
             </w:pPr>
             <w:r/>
             <w:r>
               <w:rPr>
-                <w:rFonts w:ascii="David" w:hAnsi="David"/>
+                <w:rFonts w:ascii="Calibri" w:hAnsi="Calibri"/>
+                <w:b w:val="0"/>
                 <w:sz w:val="20"/>
-                <w:rtl/>
               </w:rPr>
               <w:t>10</w:t>
             </w:r>
@@ -4864,15 +4720,14 @@
           </w:tcPr>
           <w:p>
             <w:pPr>
-              <w:bidi/>
-              <w:jc w:val="right"/>
+              <w:jc w:val="left"/>
             </w:pPr>
             <w:r/>
             <w:r>
               <w:rPr>
-                <w:rFonts w:ascii="David" w:hAnsi="David"/>
+                <w:rFonts w:ascii="Calibri" w:hAnsi="Calibri"/>
+                <w:b w:val="0"/>
                 <w:sz w:val="20"/>
-                <w:rtl/>
               </w:rPr>
               <w:t>0.1503</w:t>
             </w:r>
@@ -4884,15 +4739,14 @@
           </w:tcPr>
           <w:p>
             <w:pPr>
-              <w:bidi/>
-              <w:jc w:val="right"/>
+              <w:jc w:val="left"/>
             </w:pPr>
             <w:r/>
             <w:r>
               <w:rPr>
-                <w:rFonts w:ascii="David" w:hAnsi="David"/>
+                <w:rFonts w:ascii="Calibri" w:hAnsi="Calibri"/>
+                <w:b w:val="0"/>
                 <w:sz w:val="20"/>
-                <w:rtl/>
               </w:rPr>
               <w:t>False</w:t>
             </w:r>
@@ -4906,15 +4760,14 @@
           </w:tcPr>
           <w:p>
             <w:pPr>
-              <w:bidi/>
-              <w:jc w:val="right"/>
+              <w:jc w:val="left"/>
             </w:pPr>
             <w:r/>
             <w:r>
               <w:rPr>
-                <w:rFonts w:ascii="David" w:hAnsi="David"/>
+                <w:rFonts w:ascii="Calibri" w:hAnsi="Calibri"/>
+                <w:b w:val="0"/>
                 <w:sz w:val="20"/>
-                <w:rtl/>
               </w:rPr>
               <w:t>11</w:t>
             </w:r>
@@ -4926,15 +4779,14 @@
           </w:tcPr>
           <w:p>
             <w:pPr>
-              <w:bidi/>
-              <w:jc w:val="right"/>
+              <w:jc w:val="left"/>
             </w:pPr>
             <w:r/>
             <w:r>
               <w:rPr>
-                <w:rFonts w:ascii="David" w:hAnsi="David"/>
+                <w:rFonts w:ascii="Calibri" w:hAnsi="Calibri"/>
+                <w:b w:val="0"/>
                 <w:sz w:val="20"/>
-                <w:rtl/>
               </w:rPr>
               <w:t>0.1524</w:t>
             </w:r>
@@ -4946,15 +4798,14 @@
           </w:tcPr>
           <w:p>
             <w:pPr>
-              <w:bidi/>
-              <w:jc w:val="right"/>
+              <w:jc w:val="left"/>
             </w:pPr>
             <w:r/>
             <w:r>
               <w:rPr>
-                <w:rFonts w:ascii="David" w:hAnsi="David"/>
+                <w:rFonts w:ascii="Calibri" w:hAnsi="Calibri"/>
+                <w:b w:val="0"/>
                 <w:sz w:val="20"/>
-                <w:rtl/>
               </w:rPr>
               <w:t>False</w:t>
             </w:r>
@@ -4968,15 +4819,14 @@
           </w:tcPr>
           <w:p>
             <w:pPr>
-              <w:bidi/>
-              <w:jc w:val="right"/>
+              <w:jc w:val="left"/>
             </w:pPr>
             <w:r/>
             <w:r>
               <w:rPr>
-                <w:rFonts w:ascii="David" w:hAnsi="David"/>
+                <w:rFonts w:ascii="Calibri" w:hAnsi="Calibri"/>
+                <w:b w:val="0"/>
                 <w:sz w:val="20"/>
-                <w:rtl/>
               </w:rPr>
               <w:t>12</w:t>
             </w:r>
@@ -4988,15 +4838,14 @@
           </w:tcPr>
           <w:p>
             <w:pPr>
-              <w:bidi/>
-              <w:jc w:val="right"/>
+              <w:jc w:val="left"/>
             </w:pPr>
             <w:r/>
             <w:r>
               <w:rPr>
-                <w:rFonts w:ascii="David" w:hAnsi="David"/>
+                <w:rFonts w:ascii="Calibri" w:hAnsi="Calibri"/>
+                <w:b w:val="0"/>
                 <w:sz w:val="20"/>
-                <w:rtl/>
               </w:rPr>
               <w:t>0.1563</w:t>
             </w:r>
@@ -5008,15 +4857,14 @@
           </w:tcPr>
           <w:p>
             <w:pPr>
-              <w:bidi/>
-              <w:jc w:val="right"/>
+              <w:jc w:val="left"/>
             </w:pPr>
             <w:r/>
             <w:r>
               <w:rPr>
-                <w:rFonts w:ascii="David" w:hAnsi="David"/>
+                <w:rFonts w:ascii="Calibri" w:hAnsi="Calibri"/>
+                <w:b w:val="0"/>
                 <w:sz w:val="20"/>
-                <w:rtl/>
               </w:rPr>
               <w:t>False</w:t>
             </w:r>
@@ -5060,7 +4908,6 @@
         <w:tblStyle w:val="LightGrid-Accent1"/>
         <w:tblW w:type="auto" w:w="0"/>
         <w:tblLook w:firstColumn="1" w:firstRow="1" w:lastColumn="0" w:lastRow="0" w:noHBand="0" w:noVBand="1" w:val="04A0"/>
-        <w:bidiVisual/>
       </w:tblPr>
       <w:tblGrid>
         <w:gridCol w:w="4320"/>
@@ -5073,16 +4920,14 @@
           </w:tcPr>
           <w:p>
             <w:pPr>
-              <w:bidi/>
-              <w:jc w:val="right"/>
+              <w:jc w:val="left"/>
             </w:pPr>
             <w:r/>
             <w:r>
               <w:rPr>
-                <w:rFonts w:ascii="David" w:hAnsi="David"/>
+                <w:rFonts w:ascii="Calibri" w:hAnsi="Calibri"/>
                 <w:b/>
                 <w:sz w:val="20"/>
-                <w:rtl/>
               </w:rPr>
               <w:t>pair</w:t>
             </w:r>
@@ -5094,16 +4939,14 @@
           </w:tcPr>
           <w:p>
             <w:pPr>
-              <w:bidi/>
-              <w:jc w:val="right"/>
+              <w:jc w:val="left"/>
             </w:pPr>
             <w:r/>
             <w:r>
               <w:rPr>
-                <w:rFonts w:ascii="David" w:hAnsi="David"/>
+                <w:rFonts w:ascii="Calibri" w:hAnsi="Calibri"/>
                 <w:b/>
                 <w:sz w:val="20"/>
-                <w:rtl/>
               </w:rPr>
               <w:t>spearman</w:t>
             </w:r>
@@ -5117,15 +4960,14 @@
           </w:tcPr>
           <w:p>
             <w:pPr>
-              <w:bidi/>
-              <w:jc w:val="right"/>
+              <w:jc w:val="left"/>
             </w:pPr>
             <w:r/>
             <w:r>
               <w:rPr>
-                <w:rFonts w:ascii="David" w:hAnsi="David"/>
+                <w:rFonts w:ascii="Calibri" w:hAnsi="Calibri"/>
+                <w:b w:val="0"/>
                 <w:sz w:val="20"/>
-                <w:rtl/>
               </w:rPr>
               <w:t>Jaccard vs Cosine-text</w:t>
             </w:r>
@@ -5137,15 +4979,14 @@
           </w:tcPr>
           <w:p>
             <w:pPr>
-              <w:bidi/>
-              <w:jc w:val="right"/>
+              <w:jc w:val="left"/>
             </w:pPr>
             <w:r/>
             <w:r>
               <w:rPr>
-                <w:rFonts w:ascii="David" w:hAnsi="David"/>
+                <w:rFonts w:ascii="Calibri" w:hAnsi="Calibri"/>
+                <w:b w:val="0"/>
                 <w:sz w:val="20"/>
-                <w:rtl/>
               </w:rPr>
               <w:t>0.1834</w:t>
             </w:r>
@@ -5159,15 +5000,14 @@
           </w:tcPr>
           <w:p>
             <w:pPr>
-              <w:bidi/>
-              <w:jc w:val="right"/>
+              <w:jc w:val="left"/>
             </w:pPr>
             <w:r/>
             <w:r>
               <w:rPr>
-                <w:rFonts w:ascii="David" w:hAnsi="David"/>
+                <w:rFonts w:ascii="Calibri" w:hAnsi="Calibri"/>
+                <w:b w:val="0"/>
                 <w:sz w:val="20"/>
-                <w:rtl/>
               </w:rPr>
               <w:t>Jaccard vs Cosine-numeric</w:t>
             </w:r>
@@ -5179,15 +5019,14 @@
           </w:tcPr>
           <w:p>
             <w:pPr>
-              <w:bidi/>
-              <w:jc w:val="right"/>
+              <w:jc w:val="left"/>
             </w:pPr>
             <w:r/>
             <w:r>
               <w:rPr>
-                <w:rFonts w:ascii="David" w:hAnsi="David"/>
+                <w:rFonts w:ascii="Calibri" w:hAnsi="Calibri"/>
+                <w:b w:val="0"/>
                 <w:sz w:val="20"/>
-                <w:rtl/>
               </w:rPr>
               <w:t>0.1103</w:t>
             </w:r>
@@ -5201,15 +5040,14 @@
           </w:tcPr>
           <w:p>
             <w:pPr>
-              <w:bidi/>
-              <w:jc w:val="right"/>
+              <w:jc w:val="left"/>
             </w:pPr>
             <w:r/>
             <w:r>
               <w:rPr>
-                <w:rFonts w:ascii="David" w:hAnsi="David"/>
+                <w:rFonts w:ascii="Calibri" w:hAnsi="Calibri"/>
+                <w:b w:val="0"/>
                 <w:sz w:val="20"/>
-                <w:rtl/>
               </w:rPr>
               <w:t>Cosine-text vs Cosine-numeric</w:t>
             </w:r>
@@ -5221,15 +5059,14 @@
           </w:tcPr>
           <w:p>
             <w:pPr>
-              <w:bidi/>
-              <w:jc w:val="right"/>
+              <w:jc w:val="left"/>
             </w:pPr>
             <w:r/>
             <w:r>
               <w:rPr>
-                <w:rFonts w:ascii="David" w:hAnsi="David"/>
+                <w:rFonts w:ascii="Calibri" w:hAnsi="Calibri"/>
+                <w:b w:val="0"/>
                 <w:sz w:val="20"/>
-                <w:rtl/>
               </w:rPr>
               <w:t>0.015</w:t>
             </w:r>
@@ -5412,6 +5249,7 @@
       </w:r>
     </w:p>
     <w:p>
+      <w:bookmarkStart w:id="6" w:name="sec7"/>
       <w:pPr>
         <w:pStyle w:val="Heading1"/>
         <w:bidi/>
@@ -5425,6 +5263,7 @@
         </w:rPr>
         <w:t>7. בדיקה ואימות</w:t>
       </w:r>
+      <w:bookmarkEnd w:id="6"/>
     </w:p>
     <w:p>
       <w:pPr>
@@ -5562,6 +5401,7 @@
       </w:r>
     </w:p>
     <w:p>
+      <w:bookmarkStart w:id="7" w:name="sec8"/>
       <w:pPr>
         <w:pStyle w:val="Heading1"/>
         <w:bidi/>
@@ -5575,6 +5415,7 @@
         </w:rPr>
         <w:t>8. שיקולים אתיים</w:t>
       </w:r>
+      <w:bookmarkEnd w:id="7"/>
     </w:p>
     <w:p>
       <w:pPr>
@@ -5652,6 +5493,7 @@
       </w:r>
     </w:p>
     <w:p>
+      <w:bookmarkStart w:id="8" w:name="sec9"/>
       <w:pPr>
         <w:pStyle w:val="Heading1"/>
         <w:bidi/>
@@ -5665,6 +5507,7 @@
         </w:rPr>
         <w:t>9. מסקנות, יישום ומגבלות</w:t>
       </w:r>
+      <w:bookmarkEnd w:id="8"/>
     </w:p>
     <w:p>
       <w:pPr>
@@ -5817,6 +5660,7 @@
       </w:r>
     </w:p>
     <w:p>
+      <w:bookmarkStart w:id="9" w:name="sec10"/>
       <w:pPr>
         <w:pStyle w:val="Heading1"/>
         <w:bidi/>
@@ -5830,6 +5674,7 @@
         </w:rPr>
         <w:t>10. הערכת השפעה</w:t>
       </w:r>
+      <w:bookmarkEnd w:id="9"/>
     </w:p>
     <w:p>
       <w:pPr>

</xml_diff>

<commit_message>
docs(report): make the document natively right-to-left
Studied a reference Hebrew project report (opened via the Word MCP) to match how a
properly authored Hebrew document behaves: set the section direction and the
document default paragraph direction to RTL, so the file is natively RTL in Word
(bullets on the right, RTL base direction, gutter on the right) rather than only
patched per paragraph.

To keep everything readable under the native RTL base:
- English / numeric tables get an explicit bidiVisual=0 so their columns stay in
  logical left-to-right (mathematical) order; the Hebrew sources table stays RTL.
- The cover lines that mix Hebrew with Latin tokens and the course number / URLs
  are pinned to an LTR base so they do not get reordered.

Verified in LibreOffice: cover, clickable TOC + links, RTL body with bullets on
the right, English tables LTR, Hebrew tables RTL. Still exactly 10 pages.

Co-Authored-By: Claude Opus 4.8 <noreply@anthropic.com>
</commit_message>
<xml_diff>
--- a/docs/report/CineMatch_Report.docx
+++ b/docs/report/CineMatch_Report.docx
@@ -40,6 +40,7 @@
     <w:p/>
     <w:p>
       <w:pPr>
+        <w:bidi w:val="0"/>
         <w:jc w:val="center"/>
       </w:pPr>
       <w:r>
@@ -53,6 +54,7 @@
     </w:p>
     <w:p>
       <w:pPr>
+        <w:bidi w:val="0"/>
         <w:jc w:val="center"/>
       </w:pPr>
       <w:r>
@@ -66,6 +68,7 @@
     </w:p>
     <w:p>
       <w:pPr>
+        <w:bidi w:val="0"/>
         <w:jc w:val="center"/>
       </w:pPr>
       <w:r>
@@ -79,6 +82,7 @@
     </w:p>
     <w:p>
       <w:pPr>
+        <w:bidi w:val="0"/>
         <w:jc w:val="center"/>
       </w:pPr>
       <w:r>
@@ -93,6 +97,7 @@
     <w:p/>
     <w:p>
       <w:pPr>
+        <w:bidi w:val="0"/>
         <w:jc w:val="center"/>
       </w:pPr>
       <w:r>
@@ -115,6 +120,7 @@
     </w:p>
     <w:p>
       <w:pPr>
+        <w:bidi w:val="0"/>
         <w:jc w:val="center"/>
       </w:pPr>
       <w:r>
@@ -1197,6 +1203,7 @@
         <w:tblStyle w:val="LightGrid-Accent1"/>
         <w:tblW w:type="auto" w:w="0"/>
         <w:tblLook w:firstColumn="1" w:firstRow="1" w:lastColumn="0" w:lastRow="0" w:noHBand="0" w:noVBand="1" w:val="04A0"/>
+        <w:bidiVisual w:val="0"/>
       </w:tblPr>
       <w:tblGrid>
         <w:gridCol w:w="720"/>
@@ -1219,6 +1226,7 @@
           </w:tcPr>
           <w:p>
             <w:pPr>
+              <w:bidi w:val="0"/>
               <w:jc w:val="left"/>
             </w:pPr>
             <w:r/>
@@ -1238,6 +1246,7 @@
           </w:tcPr>
           <w:p>
             <w:pPr>
+              <w:bidi w:val="0"/>
               <w:jc w:val="left"/>
             </w:pPr>
             <w:r/>
@@ -1257,6 +1266,7 @@
           </w:tcPr>
           <w:p>
             <w:pPr>
+              <w:bidi w:val="0"/>
               <w:jc w:val="left"/>
             </w:pPr>
             <w:r/>
@@ -1276,6 +1286,7 @@
           </w:tcPr>
           <w:p>
             <w:pPr>
+              <w:bidi w:val="0"/>
               <w:jc w:val="left"/>
             </w:pPr>
             <w:r/>
@@ -1295,6 +1306,7 @@
           </w:tcPr>
           <w:p>
             <w:pPr>
+              <w:bidi w:val="0"/>
               <w:jc w:val="left"/>
             </w:pPr>
             <w:r/>
@@ -1314,6 +1326,7 @@
           </w:tcPr>
           <w:p>
             <w:pPr>
+              <w:bidi w:val="0"/>
               <w:jc w:val="left"/>
             </w:pPr>
             <w:r/>
@@ -1333,6 +1346,7 @@
           </w:tcPr>
           <w:p>
             <w:pPr>
+              <w:bidi w:val="0"/>
               <w:jc w:val="left"/>
             </w:pPr>
             <w:r/>
@@ -1352,6 +1366,7 @@
           </w:tcPr>
           <w:p>
             <w:pPr>
+              <w:bidi w:val="0"/>
               <w:jc w:val="left"/>
             </w:pPr>
             <w:r/>
@@ -1371,6 +1386,7 @@
           </w:tcPr>
           <w:p>
             <w:pPr>
+              <w:bidi w:val="0"/>
               <w:jc w:val="left"/>
             </w:pPr>
             <w:r/>
@@ -1390,6 +1406,7 @@
           </w:tcPr>
           <w:p>
             <w:pPr>
+              <w:bidi w:val="0"/>
               <w:jc w:val="left"/>
             </w:pPr>
             <w:r/>
@@ -1409,6 +1426,7 @@
           </w:tcPr>
           <w:p>
             <w:pPr>
+              <w:bidi w:val="0"/>
               <w:jc w:val="left"/>
             </w:pPr>
             <w:r/>
@@ -1428,6 +1446,7 @@
           </w:tcPr>
           <w:p>
             <w:pPr>
+              <w:bidi w:val="0"/>
               <w:jc w:val="left"/>
             </w:pPr>
             <w:r/>
@@ -1449,6 +1468,7 @@
           </w:tcPr>
           <w:p>
             <w:pPr>
+              <w:bidi w:val="0"/>
               <w:jc w:val="left"/>
             </w:pPr>
             <w:r/>
@@ -1468,6 +1488,7 @@
           </w:tcPr>
           <w:p>
             <w:pPr>
+              <w:bidi w:val="0"/>
               <w:jc w:val="left"/>
             </w:pPr>
             <w:r/>
@@ -1487,6 +1508,7 @@
           </w:tcPr>
           <w:p>
             <w:pPr>
+              <w:bidi w:val="0"/>
               <w:jc w:val="left"/>
             </w:pPr>
             <w:r/>
@@ -1506,6 +1528,7 @@
           </w:tcPr>
           <w:p>
             <w:pPr>
+              <w:bidi w:val="0"/>
               <w:jc w:val="left"/>
             </w:pPr>
             <w:r/>
@@ -1525,6 +1548,7 @@
           </w:tcPr>
           <w:p>
             <w:pPr>
+              <w:bidi w:val="0"/>
               <w:jc w:val="left"/>
             </w:pPr>
             <w:r/>
@@ -1544,6 +1568,7 @@
           </w:tcPr>
           <w:p>
             <w:pPr>
+              <w:bidi w:val="0"/>
               <w:jc w:val="left"/>
             </w:pPr>
             <w:r/>
@@ -1563,6 +1588,7 @@
           </w:tcPr>
           <w:p>
             <w:pPr>
+              <w:bidi w:val="0"/>
               <w:jc w:val="left"/>
             </w:pPr>
             <w:r/>
@@ -1582,6 +1608,7 @@
           </w:tcPr>
           <w:p>
             <w:pPr>
+              <w:bidi w:val="0"/>
               <w:jc w:val="left"/>
             </w:pPr>
             <w:r/>
@@ -1601,6 +1628,7 @@
           </w:tcPr>
           <w:p>
             <w:pPr>
+              <w:bidi w:val="0"/>
               <w:jc w:val="left"/>
             </w:pPr>
             <w:r/>
@@ -1620,6 +1648,7 @@
           </w:tcPr>
           <w:p>
             <w:pPr>
+              <w:bidi w:val="0"/>
               <w:jc w:val="left"/>
             </w:pPr>
             <w:r/>
@@ -1639,6 +1668,7 @@
           </w:tcPr>
           <w:p>
             <w:pPr>
+              <w:bidi w:val="0"/>
               <w:jc w:val="left"/>
             </w:pPr>
             <w:r/>
@@ -1658,6 +1688,7 @@
           </w:tcPr>
           <w:p>
             <w:pPr>
+              <w:bidi w:val="0"/>
               <w:jc w:val="left"/>
             </w:pPr>
             <w:r/>
@@ -1679,6 +1710,7 @@
           </w:tcPr>
           <w:p>
             <w:pPr>
+              <w:bidi w:val="0"/>
               <w:jc w:val="left"/>
             </w:pPr>
             <w:r/>
@@ -1698,6 +1730,7 @@
           </w:tcPr>
           <w:p>
             <w:pPr>
+              <w:bidi w:val="0"/>
               <w:jc w:val="left"/>
             </w:pPr>
             <w:r/>
@@ -1717,6 +1750,7 @@
           </w:tcPr>
           <w:p>
             <w:pPr>
+              <w:bidi w:val="0"/>
               <w:jc w:val="left"/>
             </w:pPr>
             <w:r/>
@@ -1736,6 +1770,7 @@
           </w:tcPr>
           <w:p>
             <w:pPr>
+              <w:bidi w:val="0"/>
               <w:jc w:val="left"/>
             </w:pPr>
             <w:r/>
@@ -1755,6 +1790,7 @@
           </w:tcPr>
           <w:p>
             <w:pPr>
+              <w:bidi w:val="0"/>
               <w:jc w:val="left"/>
             </w:pPr>
             <w:r/>
@@ -1774,6 +1810,7 @@
           </w:tcPr>
           <w:p>
             <w:pPr>
+              <w:bidi w:val="0"/>
               <w:jc w:val="left"/>
             </w:pPr>
             <w:r/>
@@ -1793,6 +1830,7 @@
           </w:tcPr>
           <w:p>
             <w:pPr>
+              <w:bidi w:val="0"/>
               <w:jc w:val="left"/>
             </w:pPr>
             <w:r/>
@@ -1812,6 +1850,7 @@
           </w:tcPr>
           <w:p>
             <w:pPr>
+              <w:bidi w:val="0"/>
               <w:jc w:val="left"/>
             </w:pPr>
             <w:r/>
@@ -1831,6 +1870,7 @@
           </w:tcPr>
           <w:p>
             <w:pPr>
+              <w:bidi w:val="0"/>
               <w:jc w:val="left"/>
             </w:pPr>
             <w:r/>
@@ -1850,6 +1890,7 @@
           </w:tcPr>
           <w:p>
             <w:pPr>
+              <w:bidi w:val="0"/>
               <w:jc w:val="left"/>
             </w:pPr>
             <w:r/>
@@ -1869,6 +1910,7 @@
           </w:tcPr>
           <w:p>
             <w:pPr>
+              <w:bidi w:val="0"/>
               <w:jc w:val="left"/>
             </w:pPr>
             <w:r/>
@@ -1888,6 +1930,7 @@
           </w:tcPr>
           <w:p>
             <w:pPr>
+              <w:bidi w:val="0"/>
               <w:jc w:val="left"/>
             </w:pPr>
             <w:r/>
@@ -1909,6 +1952,7 @@
           </w:tcPr>
           <w:p>
             <w:pPr>
+              <w:bidi w:val="0"/>
               <w:jc w:val="left"/>
             </w:pPr>
             <w:r/>
@@ -1928,6 +1972,7 @@
           </w:tcPr>
           <w:p>
             <w:pPr>
+              <w:bidi w:val="0"/>
               <w:jc w:val="left"/>
             </w:pPr>
             <w:r/>
@@ -1947,6 +1992,7 @@
           </w:tcPr>
           <w:p>
             <w:pPr>
+              <w:bidi w:val="0"/>
               <w:jc w:val="left"/>
             </w:pPr>
             <w:r/>
@@ -1966,6 +2012,7 @@
           </w:tcPr>
           <w:p>
             <w:pPr>
+              <w:bidi w:val="0"/>
               <w:jc w:val="left"/>
             </w:pPr>
             <w:r/>
@@ -1985,6 +2032,7 @@
           </w:tcPr>
           <w:p>
             <w:pPr>
+              <w:bidi w:val="0"/>
               <w:jc w:val="left"/>
             </w:pPr>
             <w:r/>
@@ -2004,6 +2052,7 @@
           </w:tcPr>
           <w:p>
             <w:pPr>
+              <w:bidi w:val="0"/>
               <w:jc w:val="left"/>
             </w:pPr>
             <w:r/>
@@ -2023,6 +2072,7 @@
           </w:tcPr>
           <w:p>
             <w:pPr>
+              <w:bidi w:val="0"/>
               <w:jc w:val="left"/>
             </w:pPr>
             <w:r/>
@@ -2042,6 +2092,7 @@
           </w:tcPr>
           <w:p>
             <w:pPr>
+              <w:bidi w:val="0"/>
               <w:jc w:val="left"/>
             </w:pPr>
             <w:r/>
@@ -2061,6 +2112,7 @@
           </w:tcPr>
           <w:p>
             <w:pPr>
+              <w:bidi w:val="0"/>
               <w:jc w:val="left"/>
             </w:pPr>
             <w:r/>
@@ -2080,6 +2132,7 @@
           </w:tcPr>
           <w:p>
             <w:pPr>
+              <w:bidi w:val="0"/>
               <w:jc w:val="left"/>
             </w:pPr>
             <w:r/>
@@ -2099,6 +2152,7 @@
           </w:tcPr>
           <w:p>
             <w:pPr>
+              <w:bidi w:val="0"/>
               <w:jc w:val="left"/>
             </w:pPr>
             <w:r/>
@@ -2118,6 +2172,7 @@
           </w:tcPr>
           <w:p>
             <w:pPr>
+              <w:bidi w:val="0"/>
               <w:jc w:val="left"/>
             </w:pPr>
             <w:r/>
@@ -2139,6 +2194,7 @@
           </w:tcPr>
           <w:p>
             <w:pPr>
+              <w:bidi w:val="0"/>
               <w:jc w:val="left"/>
             </w:pPr>
             <w:r/>
@@ -2158,6 +2214,7 @@
           </w:tcPr>
           <w:p>
             <w:pPr>
+              <w:bidi w:val="0"/>
               <w:jc w:val="left"/>
             </w:pPr>
             <w:r/>
@@ -2177,6 +2234,7 @@
           </w:tcPr>
           <w:p>
             <w:pPr>
+              <w:bidi w:val="0"/>
               <w:jc w:val="left"/>
             </w:pPr>
             <w:r/>
@@ -2196,6 +2254,7 @@
           </w:tcPr>
           <w:p>
             <w:pPr>
+              <w:bidi w:val="0"/>
               <w:jc w:val="left"/>
             </w:pPr>
             <w:r/>
@@ -2215,6 +2274,7 @@
           </w:tcPr>
           <w:p>
             <w:pPr>
+              <w:bidi w:val="0"/>
               <w:jc w:val="left"/>
             </w:pPr>
             <w:r/>
@@ -2234,6 +2294,7 @@
           </w:tcPr>
           <w:p>
             <w:pPr>
+              <w:bidi w:val="0"/>
               <w:jc w:val="left"/>
             </w:pPr>
             <w:r/>
@@ -2253,6 +2314,7 @@
           </w:tcPr>
           <w:p>
             <w:pPr>
+              <w:bidi w:val="0"/>
               <w:jc w:val="left"/>
             </w:pPr>
             <w:r/>
@@ -2272,6 +2334,7 @@
           </w:tcPr>
           <w:p>
             <w:pPr>
+              <w:bidi w:val="0"/>
               <w:jc w:val="left"/>
             </w:pPr>
             <w:r/>
@@ -2291,6 +2354,7 @@
           </w:tcPr>
           <w:p>
             <w:pPr>
+              <w:bidi w:val="0"/>
               <w:jc w:val="left"/>
             </w:pPr>
             <w:r/>
@@ -2310,6 +2374,7 @@
           </w:tcPr>
           <w:p>
             <w:pPr>
+              <w:bidi w:val="0"/>
               <w:jc w:val="left"/>
             </w:pPr>
             <w:r/>
@@ -2329,6 +2394,7 @@
           </w:tcPr>
           <w:p>
             <w:pPr>
+              <w:bidi w:val="0"/>
               <w:jc w:val="left"/>
             </w:pPr>
             <w:r/>
@@ -2348,6 +2414,7 @@
           </w:tcPr>
           <w:p>
             <w:pPr>
+              <w:bidi w:val="0"/>
               <w:jc w:val="left"/>
             </w:pPr>
             <w:r/>
@@ -2369,6 +2436,7 @@
           </w:tcPr>
           <w:p>
             <w:pPr>
+              <w:bidi w:val="0"/>
               <w:jc w:val="left"/>
             </w:pPr>
             <w:r/>
@@ -2388,6 +2456,7 @@
           </w:tcPr>
           <w:p>
             <w:pPr>
+              <w:bidi w:val="0"/>
               <w:jc w:val="left"/>
             </w:pPr>
             <w:r/>
@@ -2407,6 +2476,7 @@
           </w:tcPr>
           <w:p>
             <w:pPr>
+              <w:bidi w:val="0"/>
               <w:jc w:val="left"/>
             </w:pPr>
             <w:r/>
@@ -2426,6 +2496,7 @@
           </w:tcPr>
           <w:p>
             <w:pPr>
+              <w:bidi w:val="0"/>
               <w:jc w:val="left"/>
             </w:pPr>
             <w:r/>
@@ -2445,6 +2516,7 @@
           </w:tcPr>
           <w:p>
             <w:pPr>
+              <w:bidi w:val="0"/>
               <w:jc w:val="left"/>
             </w:pPr>
             <w:r/>
@@ -2464,6 +2536,7 @@
           </w:tcPr>
           <w:p>
             <w:pPr>
+              <w:bidi w:val="0"/>
               <w:jc w:val="left"/>
             </w:pPr>
             <w:r/>
@@ -2483,6 +2556,7 @@
           </w:tcPr>
           <w:p>
             <w:pPr>
+              <w:bidi w:val="0"/>
               <w:jc w:val="left"/>
             </w:pPr>
             <w:r/>
@@ -2502,6 +2576,7 @@
           </w:tcPr>
           <w:p>
             <w:pPr>
+              <w:bidi w:val="0"/>
               <w:jc w:val="left"/>
             </w:pPr>
             <w:r/>
@@ -2521,6 +2596,7 @@
           </w:tcPr>
           <w:p>
             <w:pPr>
+              <w:bidi w:val="0"/>
               <w:jc w:val="left"/>
             </w:pPr>
             <w:r/>
@@ -2540,6 +2616,7 @@
           </w:tcPr>
           <w:p>
             <w:pPr>
+              <w:bidi w:val="0"/>
               <w:jc w:val="left"/>
             </w:pPr>
             <w:r/>
@@ -2559,6 +2636,7 @@
           </w:tcPr>
           <w:p>
             <w:pPr>
+              <w:bidi w:val="0"/>
               <w:jc w:val="left"/>
             </w:pPr>
             <w:r/>
@@ -2578,6 +2656,7 @@
           </w:tcPr>
           <w:p>
             <w:pPr>
+              <w:bidi w:val="0"/>
               <w:jc w:val="left"/>
             </w:pPr>
             <w:r/>
@@ -2629,6 +2708,7 @@
         <w:tblStyle w:val="LightGrid-Accent1"/>
         <w:tblW w:type="auto" w:w="0"/>
         <w:tblLook w:firstColumn="1" w:firstRow="1" w:lastColumn="0" w:lastRow="0" w:noHBand="0" w:noVBand="1" w:val="04A0"/>
+        <w:bidiVisual w:val="0"/>
       </w:tblPr>
       <w:tblGrid>
         <w:gridCol w:w="1728"/>
@@ -2644,6 +2724,7 @@
           </w:tcPr>
           <w:p>
             <w:pPr>
+              <w:bidi w:val="0"/>
               <w:jc w:val="left"/>
             </w:pPr>
             <w:r/>
@@ -2663,6 +2744,7 @@
           </w:tcPr>
           <w:p>
             <w:pPr>
+              <w:bidi w:val="0"/>
               <w:jc w:val="left"/>
             </w:pPr>
             <w:r/>
@@ -2682,6 +2764,7 @@
           </w:tcPr>
           <w:p>
             <w:pPr>
+              <w:bidi w:val="0"/>
               <w:jc w:val="left"/>
             </w:pPr>
             <w:r/>
@@ -2701,6 +2784,7 @@
           </w:tcPr>
           <w:p>
             <w:pPr>
+              <w:bidi w:val="0"/>
               <w:jc w:val="left"/>
             </w:pPr>
             <w:r/>
@@ -2720,6 +2804,7 @@
           </w:tcPr>
           <w:p>
             <w:pPr>
+              <w:bidi w:val="0"/>
               <w:jc w:val="left"/>
             </w:pPr>
             <w:r/>
@@ -2741,6 +2826,7 @@
           </w:tcPr>
           <w:p>
             <w:pPr>
+              <w:bidi w:val="0"/>
               <w:jc w:val="left"/>
             </w:pPr>
             <w:r/>
@@ -2760,6 +2846,7 @@
           </w:tcPr>
           <w:p>
             <w:pPr>
+              <w:bidi w:val="0"/>
               <w:jc w:val="left"/>
             </w:pPr>
             <w:r/>
@@ -2779,6 +2866,7 @@
           </w:tcPr>
           <w:p>
             <w:pPr>
+              <w:bidi w:val="0"/>
               <w:jc w:val="left"/>
             </w:pPr>
             <w:r/>
@@ -2798,6 +2886,7 @@
           </w:tcPr>
           <w:p>
             <w:pPr>
+              <w:bidi w:val="0"/>
               <w:jc w:val="left"/>
             </w:pPr>
             <w:r/>
@@ -2817,6 +2906,7 @@
           </w:tcPr>
           <w:p>
             <w:pPr>
+              <w:bidi w:val="0"/>
               <w:jc w:val="left"/>
             </w:pPr>
             <w:r/>
@@ -2838,6 +2928,7 @@
           </w:tcPr>
           <w:p>
             <w:pPr>
+              <w:bidi w:val="0"/>
               <w:jc w:val="left"/>
             </w:pPr>
             <w:r/>
@@ -2857,6 +2948,7 @@
           </w:tcPr>
           <w:p>
             <w:pPr>
+              <w:bidi w:val="0"/>
               <w:jc w:val="left"/>
             </w:pPr>
             <w:r/>
@@ -2876,6 +2968,7 @@
           </w:tcPr>
           <w:p>
             <w:pPr>
+              <w:bidi w:val="0"/>
               <w:jc w:val="left"/>
             </w:pPr>
             <w:r/>
@@ -2895,6 +2988,7 @@
           </w:tcPr>
           <w:p>
             <w:pPr>
+              <w:bidi w:val="0"/>
               <w:jc w:val="left"/>
             </w:pPr>
             <w:r/>
@@ -2914,6 +3008,7 @@
           </w:tcPr>
           <w:p>
             <w:pPr>
+              <w:bidi w:val="0"/>
               <w:jc w:val="left"/>
             </w:pPr>
             <w:r/>
@@ -2935,6 +3030,7 @@
           </w:tcPr>
           <w:p>
             <w:pPr>
+              <w:bidi w:val="0"/>
               <w:jc w:val="left"/>
             </w:pPr>
             <w:r/>
@@ -2954,6 +3050,7 @@
           </w:tcPr>
           <w:p>
             <w:pPr>
+              <w:bidi w:val="0"/>
               <w:jc w:val="left"/>
             </w:pPr>
             <w:r/>
@@ -2973,6 +3070,7 @@
           </w:tcPr>
           <w:p>
             <w:pPr>
+              <w:bidi w:val="0"/>
               <w:jc w:val="left"/>
             </w:pPr>
             <w:r/>
@@ -2992,6 +3090,7 @@
           </w:tcPr>
           <w:p>
             <w:pPr>
+              <w:bidi w:val="0"/>
               <w:jc w:val="left"/>
             </w:pPr>
             <w:r/>
@@ -3011,6 +3110,7 @@
           </w:tcPr>
           <w:p>
             <w:pPr>
+              <w:bidi w:val="0"/>
               <w:jc w:val="left"/>
             </w:pPr>
             <w:r/>
@@ -3032,6 +3132,7 @@
           </w:tcPr>
           <w:p>
             <w:pPr>
+              <w:bidi w:val="0"/>
               <w:jc w:val="left"/>
             </w:pPr>
             <w:r/>
@@ -3051,6 +3152,7 @@
           </w:tcPr>
           <w:p>
             <w:pPr>
+              <w:bidi w:val="0"/>
               <w:jc w:val="left"/>
             </w:pPr>
             <w:r/>
@@ -3070,6 +3172,7 @@
           </w:tcPr>
           <w:p>
             <w:pPr>
+              <w:bidi w:val="0"/>
               <w:jc w:val="left"/>
             </w:pPr>
             <w:r/>
@@ -3089,6 +3192,7 @@
           </w:tcPr>
           <w:p>
             <w:pPr>
+              <w:bidi w:val="0"/>
               <w:jc w:val="left"/>
             </w:pPr>
             <w:r/>
@@ -3108,6 +3212,7 @@
           </w:tcPr>
           <w:p>
             <w:pPr>
+              <w:bidi w:val="0"/>
               <w:jc w:val="left"/>
             </w:pPr>
             <w:r/>
@@ -3129,6 +3234,7 @@
           </w:tcPr>
           <w:p>
             <w:pPr>
+              <w:bidi w:val="0"/>
               <w:jc w:val="left"/>
             </w:pPr>
             <w:r/>
@@ -3148,6 +3254,7 @@
           </w:tcPr>
           <w:p>
             <w:pPr>
+              <w:bidi w:val="0"/>
               <w:jc w:val="left"/>
             </w:pPr>
             <w:r/>
@@ -3167,6 +3274,7 @@
           </w:tcPr>
           <w:p>
             <w:pPr>
+              <w:bidi w:val="0"/>
               <w:jc w:val="left"/>
             </w:pPr>
             <w:r/>
@@ -3186,6 +3294,7 @@
           </w:tcPr>
           <w:p>
             <w:pPr>
+              <w:bidi w:val="0"/>
               <w:jc w:val="left"/>
             </w:pPr>
             <w:r/>
@@ -3205,6 +3314,7 @@
           </w:tcPr>
           <w:p>
             <w:pPr>
+              <w:bidi w:val="0"/>
               <w:jc w:val="left"/>
             </w:pPr>
             <w:r/>
@@ -3318,6 +3428,7 @@
         <w:tblStyle w:val="LightGrid-Accent1"/>
         <w:tblW w:type="auto" w:w="0"/>
         <w:tblLook w:firstColumn="1" w:firstRow="1" w:lastColumn="0" w:lastRow="0" w:noHBand="0" w:noVBand="1" w:val="04A0"/>
+        <w:bidiVisual w:val="0"/>
       </w:tblPr>
       <w:tblGrid>
         <w:gridCol w:w="1440"/>
@@ -3334,6 +3445,7 @@
           </w:tcPr>
           <w:p>
             <w:pPr>
+              <w:bidi w:val="0"/>
               <w:jc w:val="left"/>
             </w:pPr>
             <w:r/>
@@ -3353,6 +3465,7 @@
           </w:tcPr>
           <w:p>
             <w:pPr>
+              <w:bidi w:val="0"/>
               <w:jc w:val="left"/>
             </w:pPr>
             <w:r/>
@@ -3372,6 +3485,7 @@
           </w:tcPr>
           <w:p>
             <w:pPr>
+              <w:bidi w:val="0"/>
               <w:jc w:val="left"/>
             </w:pPr>
             <w:r/>
@@ -3391,6 +3505,7 @@
           </w:tcPr>
           <w:p>
             <w:pPr>
+              <w:bidi w:val="0"/>
               <w:jc w:val="left"/>
             </w:pPr>
             <w:r/>
@@ -3410,6 +3525,7 @@
           </w:tcPr>
           <w:p>
             <w:pPr>
+              <w:bidi w:val="0"/>
               <w:jc w:val="left"/>
             </w:pPr>
             <w:r/>
@@ -3429,6 +3545,7 @@
           </w:tcPr>
           <w:p>
             <w:pPr>
+              <w:bidi w:val="0"/>
               <w:jc w:val="left"/>
             </w:pPr>
             <w:r/>
@@ -3450,6 +3567,7 @@
           </w:tcPr>
           <w:p>
             <w:pPr>
+              <w:bidi w:val="0"/>
               <w:jc w:val="left"/>
             </w:pPr>
             <w:r/>
@@ -3469,6 +3587,7 @@
           </w:tcPr>
           <w:p>
             <w:pPr>
+              <w:bidi w:val="0"/>
               <w:jc w:val="left"/>
             </w:pPr>
             <w:r/>
@@ -3488,6 +3607,7 @@
           </w:tcPr>
           <w:p>
             <w:pPr>
+              <w:bidi w:val="0"/>
               <w:jc w:val="left"/>
             </w:pPr>
             <w:r/>
@@ -3507,6 +3627,7 @@
           </w:tcPr>
           <w:p>
             <w:pPr>
+              <w:bidi w:val="0"/>
               <w:jc w:val="left"/>
             </w:pPr>
             <w:r/>
@@ -3526,6 +3647,7 @@
           </w:tcPr>
           <w:p>
             <w:pPr>
+              <w:bidi w:val="0"/>
               <w:jc w:val="left"/>
             </w:pPr>
             <w:r/>
@@ -3545,6 +3667,7 @@
           </w:tcPr>
           <w:p>
             <w:pPr>
+              <w:bidi w:val="0"/>
               <w:jc w:val="left"/>
             </w:pPr>
             <w:r/>
@@ -3566,6 +3689,7 @@
           </w:tcPr>
           <w:p>
             <w:pPr>
+              <w:bidi w:val="0"/>
               <w:jc w:val="left"/>
             </w:pPr>
             <w:r/>
@@ -3585,6 +3709,7 @@
           </w:tcPr>
           <w:p>
             <w:pPr>
+              <w:bidi w:val="0"/>
               <w:jc w:val="left"/>
             </w:pPr>
             <w:r/>
@@ -3604,6 +3729,7 @@
           </w:tcPr>
           <w:p>
             <w:pPr>
+              <w:bidi w:val="0"/>
               <w:jc w:val="left"/>
             </w:pPr>
             <w:r/>
@@ -3623,6 +3749,7 @@
           </w:tcPr>
           <w:p>
             <w:pPr>
+              <w:bidi w:val="0"/>
               <w:jc w:val="left"/>
             </w:pPr>
             <w:r/>
@@ -3642,6 +3769,7 @@
           </w:tcPr>
           <w:p>
             <w:pPr>
+              <w:bidi w:val="0"/>
               <w:jc w:val="left"/>
             </w:pPr>
             <w:r/>
@@ -3661,6 +3789,7 @@
           </w:tcPr>
           <w:p>
             <w:pPr>
+              <w:bidi w:val="0"/>
               <w:jc w:val="left"/>
             </w:pPr>
             <w:r/>
@@ -3682,6 +3811,7 @@
           </w:tcPr>
           <w:p>
             <w:pPr>
+              <w:bidi w:val="0"/>
               <w:jc w:val="left"/>
             </w:pPr>
             <w:r/>
@@ -3701,6 +3831,7 @@
           </w:tcPr>
           <w:p>
             <w:pPr>
+              <w:bidi w:val="0"/>
               <w:jc w:val="left"/>
             </w:pPr>
             <w:r/>
@@ -3720,6 +3851,7 @@
           </w:tcPr>
           <w:p>
             <w:pPr>
+              <w:bidi w:val="0"/>
               <w:jc w:val="left"/>
             </w:pPr>
             <w:r/>
@@ -3739,6 +3871,7 @@
           </w:tcPr>
           <w:p>
             <w:pPr>
+              <w:bidi w:val="0"/>
               <w:jc w:val="left"/>
             </w:pPr>
             <w:r/>
@@ -3758,6 +3891,7 @@
           </w:tcPr>
           <w:p>
             <w:pPr>
+              <w:bidi w:val="0"/>
               <w:jc w:val="left"/>
             </w:pPr>
             <w:r/>
@@ -3777,6 +3911,7 @@
           </w:tcPr>
           <w:p>
             <w:pPr>
+              <w:bidi w:val="0"/>
               <w:jc w:val="left"/>
             </w:pPr>
             <w:r/>
@@ -3798,6 +3933,7 @@
           </w:tcPr>
           <w:p>
             <w:pPr>
+              <w:bidi w:val="0"/>
               <w:jc w:val="left"/>
             </w:pPr>
             <w:r/>
@@ -3817,6 +3953,7 @@
           </w:tcPr>
           <w:p>
             <w:pPr>
+              <w:bidi w:val="0"/>
               <w:jc w:val="left"/>
             </w:pPr>
             <w:r/>
@@ -3836,6 +3973,7 @@
           </w:tcPr>
           <w:p>
             <w:pPr>
+              <w:bidi w:val="0"/>
               <w:jc w:val="left"/>
             </w:pPr>
             <w:r/>
@@ -3855,6 +3993,7 @@
           </w:tcPr>
           <w:p>
             <w:pPr>
+              <w:bidi w:val="0"/>
               <w:jc w:val="left"/>
             </w:pPr>
             <w:r/>
@@ -3874,6 +4013,7 @@
           </w:tcPr>
           <w:p>
             <w:pPr>
+              <w:bidi w:val="0"/>
               <w:jc w:val="left"/>
             </w:pPr>
             <w:r/>
@@ -3893,6 +4033,7 @@
           </w:tcPr>
           <w:p>
             <w:pPr>
+              <w:bidi w:val="0"/>
               <w:jc w:val="left"/>
             </w:pPr>
             <w:r/>
@@ -3914,6 +4055,7 @@
           </w:tcPr>
           <w:p>
             <w:pPr>
+              <w:bidi w:val="0"/>
               <w:jc w:val="left"/>
             </w:pPr>
             <w:r/>
@@ -3933,6 +4075,7 @@
           </w:tcPr>
           <w:p>
             <w:pPr>
+              <w:bidi w:val="0"/>
               <w:jc w:val="left"/>
             </w:pPr>
             <w:r/>
@@ -3952,6 +4095,7 @@
           </w:tcPr>
           <w:p>
             <w:pPr>
+              <w:bidi w:val="0"/>
               <w:jc w:val="left"/>
             </w:pPr>
             <w:r/>
@@ -3971,6 +4115,7 @@
           </w:tcPr>
           <w:p>
             <w:pPr>
+              <w:bidi w:val="0"/>
               <w:jc w:val="left"/>
             </w:pPr>
             <w:r/>
@@ -3990,6 +4135,7 @@
           </w:tcPr>
           <w:p>
             <w:pPr>
+              <w:bidi w:val="0"/>
               <w:jc w:val="left"/>
             </w:pPr>
             <w:r/>
@@ -4009,6 +4155,7 @@
           </w:tcPr>
           <w:p>
             <w:pPr>
+              <w:bidi w:val="0"/>
               <w:jc w:val="left"/>
             </w:pPr>
             <w:r/>
@@ -4030,6 +4177,7 @@
           </w:tcPr>
           <w:p>
             <w:pPr>
+              <w:bidi w:val="0"/>
               <w:jc w:val="left"/>
             </w:pPr>
             <w:r/>
@@ -4049,6 +4197,7 @@
           </w:tcPr>
           <w:p>
             <w:pPr>
+              <w:bidi w:val="0"/>
               <w:jc w:val="left"/>
             </w:pPr>
             <w:r/>
@@ -4068,6 +4217,7 @@
           </w:tcPr>
           <w:p>
             <w:pPr>
+              <w:bidi w:val="0"/>
               <w:jc w:val="left"/>
             </w:pPr>
             <w:r/>
@@ -4087,6 +4237,7 @@
           </w:tcPr>
           <w:p>
             <w:pPr>
+              <w:bidi w:val="0"/>
               <w:jc w:val="left"/>
             </w:pPr>
             <w:r/>
@@ -4106,6 +4257,7 @@
           </w:tcPr>
           <w:p>
             <w:pPr>
+              <w:bidi w:val="0"/>
               <w:jc w:val="left"/>
             </w:pPr>
             <w:r/>
@@ -4125,6 +4277,7 @@
           </w:tcPr>
           <w:p>
             <w:pPr>
+              <w:bidi w:val="0"/>
               <w:jc w:val="left"/>
             </w:pPr>
             <w:r/>
@@ -4146,6 +4299,7 @@
           </w:tcPr>
           <w:p>
             <w:pPr>
+              <w:bidi w:val="0"/>
               <w:jc w:val="left"/>
             </w:pPr>
             <w:r/>
@@ -4165,6 +4319,7 @@
           </w:tcPr>
           <w:p>
             <w:pPr>
+              <w:bidi w:val="0"/>
               <w:jc w:val="left"/>
             </w:pPr>
             <w:r/>
@@ -4184,6 +4339,7 @@
           </w:tcPr>
           <w:p>
             <w:pPr>
+              <w:bidi w:val="0"/>
               <w:jc w:val="left"/>
             </w:pPr>
             <w:r/>
@@ -4203,6 +4359,7 @@
           </w:tcPr>
           <w:p>
             <w:pPr>
+              <w:bidi w:val="0"/>
               <w:jc w:val="left"/>
             </w:pPr>
             <w:r/>
@@ -4222,6 +4379,7 @@
           </w:tcPr>
           <w:p>
             <w:pPr>
+              <w:bidi w:val="0"/>
               <w:jc w:val="left"/>
             </w:pPr>
             <w:r/>
@@ -4241,6 +4399,7 @@
           </w:tcPr>
           <w:p>
             <w:pPr>
+              <w:bidi w:val="0"/>
               <w:jc w:val="left"/>
             </w:pPr>
             <w:r/>
@@ -4262,6 +4421,7 @@
           </w:tcPr>
           <w:p>
             <w:pPr>
+              <w:bidi w:val="0"/>
               <w:jc w:val="left"/>
             </w:pPr>
             <w:r/>
@@ -4281,6 +4441,7 @@
           </w:tcPr>
           <w:p>
             <w:pPr>
+              <w:bidi w:val="0"/>
               <w:jc w:val="left"/>
             </w:pPr>
             <w:r/>
@@ -4300,6 +4461,7 @@
           </w:tcPr>
           <w:p>
             <w:pPr>
+              <w:bidi w:val="0"/>
               <w:jc w:val="left"/>
             </w:pPr>
             <w:r/>
@@ -4319,6 +4481,7 @@
           </w:tcPr>
           <w:p>
             <w:pPr>
+              <w:bidi w:val="0"/>
               <w:jc w:val="left"/>
             </w:pPr>
             <w:r/>
@@ -4338,6 +4501,7 @@
           </w:tcPr>
           <w:p>
             <w:pPr>
+              <w:bidi w:val="0"/>
               <w:jc w:val="left"/>
             </w:pPr>
             <w:r/>
@@ -4357,6 +4521,7 @@
           </w:tcPr>
           <w:p>
             <w:pPr>
+              <w:bidi w:val="0"/>
               <w:jc w:val="left"/>
             </w:pPr>
             <w:r/>
@@ -4393,6 +4558,7 @@
         <w:tblStyle w:val="LightGrid-Accent1"/>
         <w:tblW w:type="auto" w:w="0"/>
         <w:tblLook w:firstColumn="1" w:firstRow="1" w:lastColumn="0" w:lastRow="0" w:noHBand="0" w:noVBand="1" w:val="04A0"/>
+        <w:bidiVisual w:val="0"/>
       </w:tblPr>
       <w:tblGrid>
         <w:gridCol w:w="2880"/>
@@ -4406,6 +4572,7 @@
           </w:tcPr>
           <w:p>
             <w:pPr>
+              <w:bidi w:val="0"/>
               <w:jc w:val="left"/>
             </w:pPr>
             <w:r/>
@@ -4425,6 +4592,7 @@
           </w:tcPr>
           <w:p>
             <w:pPr>
+              <w:bidi w:val="0"/>
               <w:jc w:val="left"/>
             </w:pPr>
             <w:r/>
@@ -4444,6 +4612,7 @@
           </w:tcPr>
           <w:p>
             <w:pPr>
+              <w:bidi w:val="0"/>
               <w:jc w:val="left"/>
             </w:pPr>
             <w:r/>
@@ -4465,6 +4634,7 @@
           </w:tcPr>
           <w:p>
             <w:pPr>
+              <w:bidi w:val="0"/>
               <w:jc w:val="left"/>
             </w:pPr>
             <w:r/>
@@ -4484,6 +4654,7 @@
           </w:tcPr>
           <w:p>
             <w:pPr>
+              <w:bidi w:val="0"/>
               <w:jc w:val="left"/>
             </w:pPr>
             <w:r/>
@@ -4503,6 +4674,7 @@
           </w:tcPr>
           <w:p>
             <w:pPr>
+              <w:bidi w:val="0"/>
               <w:jc w:val="left"/>
             </w:pPr>
             <w:r/>
@@ -4524,6 +4696,7 @@
           </w:tcPr>
           <w:p>
             <w:pPr>
+              <w:bidi w:val="0"/>
               <w:jc w:val="left"/>
             </w:pPr>
             <w:r/>
@@ -4543,6 +4716,7 @@
           </w:tcPr>
           <w:p>
             <w:pPr>
+              <w:bidi w:val="0"/>
               <w:jc w:val="left"/>
             </w:pPr>
             <w:r/>
@@ -4562,6 +4736,7 @@
           </w:tcPr>
           <w:p>
             <w:pPr>
+              <w:bidi w:val="0"/>
               <w:jc w:val="left"/>
             </w:pPr>
             <w:r/>
@@ -4583,6 +4758,7 @@
           </w:tcPr>
           <w:p>
             <w:pPr>
+              <w:bidi w:val="0"/>
               <w:jc w:val="left"/>
             </w:pPr>
             <w:r/>
@@ -4602,6 +4778,7 @@
           </w:tcPr>
           <w:p>
             <w:pPr>
+              <w:bidi w:val="0"/>
               <w:jc w:val="left"/>
             </w:pPr>
             <w:r/>
@@ -4621,6 +4798,7 @@
           </w:tcPr>
           <w:p>
             <w:pPr>
+              <w:bidi w:val="0"/>
               <w:jc w:val="left"/>
             </w:pPr>
             <w:r/>
@@ -4642,6 +4820,7 @@
           </w:tcPr>
           <w:p>
             <w:pPr>
+              <w:bidi w:val="0"/>
               <w:jc w:val="left"/>
             </w:pPr>
             <w:r/>
@@ -4661,6 +4840,7 @@
           </w:tcPr>
           <w:p>
             <w:pPr>
+              <w:bidi w:val="0"/>
               <w:jc w:val="left"/>
             </w:pPr>
             <w:r/>
@@ -4680,6 +4860,7 @@
           </w:tcPr>
           <w:p>
             <w:pPr>
+              <w:bidi w:val="0"/>
               <w:jc w:val="left"/>
             </w:pPr>
             <w:r/>
@@ -4701,6 +4882,7 @@
           </w:tcPr>
           <w:p>
             <w:pPr>
+              <w:bidi w:val="0"/>
               <w:jc w:val="left"/>
             </w:pPr>
             <w:r/>
@@ -4720,6 +4902,7 @@
           </w:tcPr>
           <w:p>
             <w:pPr>
+              <w:bidi w:val="0"/>
               <w:jc w:val="left"/>
             </w:pPr>
             <w:r/>
@@ -4739,6 +4922,7 @@
           </w:tcPr>
           <w:p>
             <w:pPr>
+              <w:bidi w:val="0"/>
               <w:jc w:val="left"/>
             </w:pPr>
             <w:r/>
@@ -4760,6 +4944,7 @@
           </w:tcPr>
           <w:p>
             <w:pPr>
+              <w:bidi w:val="0"/>
               <w:jc w:val="left"/>
             </w:pPr>
             <w:r/>
@@ -4779,6 +4964,7 @@
           </w:tcPr>
           <w:p>
             <w:pPr>
+              <w:bidi w:val="0"/>
               <w:jc w:val="left"/>
             </w:pPr>
             <w:r/>
@@ -4798,6 +4984,7 @@
           </w:tcPr>
           <w:p>
             <w:pPr>
+              <w:bidi w:val="0"/>
               <w:jc w:val="left"/>
             </w:pPr>
             <w:r/>
@@ -4819,6 +5006,7 @@
           </w:tcPr>
           <w:p>
             <w:pPr>
+              <w:bidi w:val="0"/>
               <w:jc w:val="left"/>
             </w:pPr>
             <w:r/>
@@ -4838,6 +5026,7 @@
           </w:tcPr>
           <w:p>
             <w:pPr>
+              <w:bidi w:val="0"/>
               <w:jc w:val="left"/>
             </w:pPr>
             <w:r/>
@@ -4857,6 +5046,7 @@
           </w:tcPr>
           <w:p>
             <w:pPr>
+              <w:bidi w:val="0"/>
               <w:jc w:val="left"/>
             </w:pPr>
             <w:r/>
@@ -4908,6 +5098,7 @@
         <w:tblStyle w:val="LightGrid-Accent1"/>
         <w:tblW w:type="auto" w:w="0"/>
         <w:tblLook w:firstColumn="1" w:firstRow="1" w:lastColumn="0" w:lastRow="0" w:noHBand="0" w:noVBand="1" w:val="04A0"/>
+        <w:bidiVisual w:val="0"/>
       </w:tblPr>
       <w:tblGrid>
         <w:gridCol w:w="4320"/>
@@ -4920,6 +5111,7 @@
           </w:tcPr>
           <w:p>
             <w:pPr>
+              <w:bidi w:val="0"/>
               <w:jc w:val="left"/>
             </w:pPr>
             <w:r/>
@@ -4939,6 +5131,7 @@
           </w:tcPr>
           <w:p>
             <w:pPr>
+              <w:bidi w:val="0"/>
               <w:jc w:val="left"/>
             </w:pPr>
             <w:r/>
@@ -4960,6 +5153,7 @@
           </w:tcPr>
           <w:p>
             <w:pPr>
+              <w:bidi w:val="0"/>
               <w:jc w:val="left"/>
             </w:pPr>
             <w:r/>
@@ -4979,6 +5173,7 @@
           </w:tcPr>
           <w:p>
             <w:pPr>
+              <w:bidi w:val="0"/>
               <w:jc w:val="left"/>
             </w:pPr>
             <w:r/>
@@ -5000,6 +5195,7 @@
           </w:tcPr>
           <w:p>
             <w:pPr>
+              <w:bidi w:val="0"/>
               <w:jc w:val="left"/>
             </w:pPr>
             <w:r/>
@@ -5019,6 +5215,7 @@
           </w:tcPr>
           <w:p>
             <w:pPr>
+              <w:bidi w:val="0"/>
               <w:jc w:val="left"/>
             </w:pPr>
             <w:r/>
@@ -5040,6 +5237,7 @@
           </w:tcPr>
           <w:p>
             <w:pPr>
+              <w:bidi w:val="0"/>
               <w:jc w:val="left"/>
             </w:pPr>
             <w:r/>
@@ -5059,6 +5257,7 @@
           </w:tcPr>
           <w:p>
             <w:pPr>
+              <w:bidi w:val="0"/>
               <w:jc w:val="left"/>
             </w:pPr>
             <w:r/>
@@ -5801,6 +6000,7 @@
       <w:pgMar w:top="1440" w:right="1800" w:bottom="1440" w:left="1800" w:header="720" w:footer="720" w:gutter="0"/>
       <w:cols w:space="720"/>
       <w:docGrid w:linePitch="360"/>
+      <w:bidi/>
     </w:sectPr>
   </w:body>
 </w:document>
@@ -6023,6 +6223,7 @@
     <w:pPrDefault>
       <w:pPr>
         <w:spacing w:after="200" w:line="276" w:lineRule="auto"/>
+        <w:bidi/>
       </w:pPr>
     </w:pPrDefault>
   </w:docDefaults>

</xml_diff>